<commit_message>
docs: proposal + deck regen (1100+), CR-15 closed in backlog
Generated with [Devin](https://devin.ai)

Co-Authored-By: Devin <158243242+devin-ai-integration[bot]@users.noreply.github.com>
</commit_message>
<xml_diff>
--- a/docs/proposal-vieschool-khach-hang.docx
+++ b/docs/proposal-vieschool-khach-hang.docx
@@ -240,7 +240,7 @@
               <w:rPr>
                 <w:sz w:val="19"/>
               </w:rPr>
-              <w:t>Luyện tiếng Anh bám SGK Global Success qua hành trình phiêu lưu 5 vùng đất cùng mascot Bé Heo. 524+ từ vựng có hình minh họa và giải thích tiếng Việt, 4 vòng luyện: nghe, đọc, ghép cặp, phát âm chấm điểm.</w:t>
+              <w:t>Luyện tiếng Anh bám SGK Global Success qua hành trình phiêu lưu 5 vùng đất cùng mascot Bé Heo. 1100+ từ vựng có hình minh họa và giải thích tiếng Việt, 4 vòng luyện: nghe, đọc, ghép cặp, phát âm chấm điểm.</w:t>
             </w:r>
           </w:p>
         </w:tc>
@@ -814,12 +814,13 @@
             <w:shd w:val="clear" w:fill="F4F6FA"/>
           </w:tcPr>
           <w:p>
-            <w:r/>
+            <w:r>
+              <w:t>Chỉ tiếng Anh, hiện mới phủ lớp 1-5; vốn từ còn ít hơn các app nội địa lâu năm</w:t>
+            </w:r>
             <w:r>
               <w:rPr>
                 <w:sz w:val="19"/>
               </w:rPr>
-              <w:t>Chỉ tiếng Anh, hiện mới phủ lớp 1-5; kho nội dung 524+ từ - nhỏ hơn app nội địa lâu năm</w:t>
             </w:r>
           </w:p>
         </w:tc>

</xml_diff>

<commit_message>
CR-18: fix silent TTS on mobile + retryable recording errors; fix TT 17/2025 citations
- speech.ts: deferred speak() after cancel(), watchdog surfaces silent failures
- pronunciation recording: error phase + "Thu lai" retry instead of swallowing errors
- marketing copy: TT 17/2025 applies to History/Geography/Civics, not English -
  corrected proposal generators, DOCX, landing copy and CR-14 notes

Generated with [Devin](https://devin.ai)

Co-Authored-By: Devin <158243242+devin-ai-integration[bot]@users.noreply.github.com>
</commit_message>
<xml_diff>
--- a/docs/proposal-vieschool-khach-hang.docx
+++ b/docs/proposal-vieschool-khach-hang.docx
@@ -302,7 +302,7 @@
               <w:rPr>
                 <w:sz w:val="19"/>
               </w:rPr>
-              <w:t>12 công cụ biên soạn học liệu theo CTGDPT 2018 (cập nhật Thông tư 17/2025): ngân hàng câu hỏi, ma trận đề, đề kiểm tra có công thức toán Word-native, kế hoạch bài dạy, phiếu học tập - xuất DOCX/PDF đúng format nhà trường.</w:t>
+              <w:t>12 công cụ biên soạn học liệu theo CTGDPT 2018 (gồm các sửa đổi của Thông tư 17/2025 cho Lịch sử, Địa lí, Giáo dục công dân): ngân hàng câu hỏi, ma trận đề, đề kiểm tra có công thức toán Word-native, kế hoạch bài dạy, phiếu học tập - xuất DOCX/PDF đúng format nhà trường.</w:t>
             </w:r>
           </w:p>
         </w:tc>
@@ -980,7 +980,7 @@
               <w:rPr>
                 <w:sz w:val="19"/>
               </w:rPr>
-              <w:t>CTGDPT 2018 (cập nhật TT 17/2025), gắn mã yêu cầu cần đạt</w:t>
+              <w:t>CTGDPT 2018 (gồm sửa đổi của TT 17/2025 cho Lịch sử, Địa lí, GDCD), gắn mã yêu cầu cần đạt</w:t>
             </w:r>
           </w:p>
         </w:tc>
@@ -3337,7 +3337,7 @@
         <w:t xml:space="preserve">Đúng chương trình Việt Nam: </w:t>
       </w:r>
       <w:r>
-        <w:t>Nội dung bám Global Success và CTGDPT 2018 (cập nhật Thông tư 17/2025) - luyện trên app là học đúng điều đang học trên lớp.</w:t>
+        <w:t>Nội dung bám SGK Tiếng Anh Global Success theo CTGDPT 2018 - luyện trên app là học đúng điều đang học trên lớp.</w:t>
       </w:r>
     </w:p>
     <w:p>

</xml_diff>

<commit_message>
CR-54: refresh landing + customer proposal for V6 bank and 3-program scope
Marketing artifacts were describing the pre-V6 product (1100+ vocab,
stale per-grade pricing in the docx, "English only" weakness). Updated
to the verified current state: 11.400+ questions with Vietnamese
explanations, 270 blueprint exam forms, 3 English-medium programs,
practice timing, licensed visual assets. Docx is now generated by
gen-customer-proposal-doc.py so it cannot drift from the deck again.

Generated with [Devin](https://devin.ai)

Co-Authored-By: Devin <158243242+devin-ai-integration[bot]@users.noreply.github.com>
</commit_message>
<xml_diff>
--- a/docs/proposal-vieschool-khach-hang.docx
+++ b/docs/proposal-vieschool-khach-hang.docx
@@ -4,7 +4,7 @@
   <w:body>
     <w:p>
       <w:pPr>
-        <w:spacing w:before="1200"/>
+        <w:jc w:val="center"/>
       </w:pPr>
       <w:r>
         <w:rPr>
@@ -18,117 +18,63 @@
     <w:p>
       <w:r>
         <w:rPr>
-          <w:color w:val="B47B06"/>
-          <w:sz w:val="32"/>
+          <w:sz w:val="22"/>
         </w:rPr>
         <w:t>Hệ sinh thái số cho trường học Việt Nam</w:t>
+        <w:br/>
+        <w:t>Một nền tảng - ba sản phẩm - hỗ trợ lớp 1 đến lớp 12</w:t>
       </w:r>
     </w:p>
     <w:p>
       <w:r>
         <w:rPr>
-          <w:i/>
-          <w:color w:val="556070"/>
-          <w:sz w:val="22"/>
-        </w:rPr>
-        <w:t>Một nền tảng - ba sản phẩm - hỗ trợ lớp 1 đến lớp 12</w:t>
-      </w:r>
-    </w:p>
-    <w:p>
-      <w:pPr>
-        <w:spacing w:after="120"/>
-      </w:pPr>
-      <w:r>
-        <w:rPr>
-          <w:b w:val="0"/>
-          <w:i w:val="0"/>
-          <w:sz w:val="21"/>
-        </w:rPr>
-      </w:r>
-    </w:p>
-    <w:p>
-      <w:pPr>
-        <w:spacing w:after="120"/>
-      </w:pPr>
-      <w:r>
-        <w:rPr>
-          <w:b w:val="0"/>
-          <w:i w:val="0"/>
-          <w:color w:val="556070"/>
-          <w:sz w:val="21"/>
+          <w:sz w:val="20"/>
         </w:rPr>
         <w:t>Tài liệu giới thiệu sản phẩm - dành cho nhà trường, giáo viên và phụ huynh</w:t>
-      </w:r>
-    </w:p>
-    <w:p>
-      <w:pPr>
-        <w:spacing w:after="120"/>
-      </w:pPr>
-      <w:r>
-        <w:rPr>
-          <w:b/>
-          <w:i w:val="0"/>
-          <w:sz w:val="21"/>
-        </w:rPr>
+        <w:br/>
         <w:t>Website: vieschool.com</w:t>
       </w:r>
     </w:p>
     <w:p>
       <w:r>
-        <w:br w:type="page"/>
-      </w:r>
-    </w:p>
-    <w:p>
-      <w:pPr>
-        <w:spacing w:before="280" w:after="120"/>
-      </w:pPr>
-      <w:r>
         <w:rPr>
           <w:b/>
           <w:color w:val="0B1B3A"/>
-          <w:sz w:val="28"/>
+          <w:sz w:val="36"/>
         </w:rPr>
         <w:t>1. VieSchool là gì?</w:t>
       </w:r>
     </w:p>
     <w:p>
-      <w:pPr>
-        <w:spacing w:after="120"/>
-      </w:pPr>
       <w:r>
         <w:rPr>
-          <w:b w:val="0"/>
-          <w:i w:val="0"/>
-          <w:sz w:val="21"/>
+          <w:sz w:val="22"/>
         </w:rPr>
-        <w:t>VieSchool là hệ sinh thái số cho trường học Việt Nam, gồm 3 sản phẩm vận hành độc lập nhưng cùng một bản sắc và cùng một nền tảng dữ liệu. Mục tiêu: trường mua một nền tảng thay vì ba ứng dụng rời rạc - dữ liệu lớp học, tài khoản và phân quyền thống nhất.</w:t>
+        <w:t>VieSchool là hệ sinh thái số cho trường học Việt Nam, gồm 3 sản phẩm vận hành độc lập nhưng cùng một nhận diện và tài khoản:</w:t>
       </w:r>
     </w:p>
     <w:tbl>
       <w:tblPr>
         <w:tblStyle w:val="TableGrid"/>
         <w:tblW w:type="auto" w:w="0"/>
-        <w:jc w:val="center"/>
         <w:tblLook w:firstColumn="1" w:firstRow="1" w:lastColumn="0" w:lastRow="0" w:noHBand="0" w:noVBand="1" w:val="04A0"/>
       </w:tblPr>
       <w:tblGrid>
-        <w:gridCol w:w="2436"/>
-        <w:gridCol w:w="2436"/>
-        <w:gridCol w:w="2436"/>
-        <w:gridCol w:w="2436"/>
+        <w:gridCol w:w="2160"/>
+        <w:gridCol w:w="2160"/>
+        <w:gridCol w:w="2160"/>
+        <w:gridCol w:w="2160"/>
       </w:tblGrid>
       <w:tr>
         <w:tc>
           <w:tcPr>
-            <w:tcW w:type="dxa" w:w="1814"/>
-            <w:shd w:val="clear" w:fill="0B1B3A"/>
+            <w:tcW w:type="dxa" w:w="2160"/>
           </w:tcPr>
           <w:p>
-            <w:r/>
             <w:r>
               <w:rPr>
                 <w:b/>
-                <w:color w:val="FFFFFF"/>
+                <w:color w:val="0B1B3A"/>
                 <w:sz w:val="19"/>
               </w:rPr>
               <w:t>Sản phẩm</w:t>
@@ -137,15 +83,13 @@
         </w:tc>
         <w:tc>
           <w:tcPr>
-            <w:tcW w:type="dxa" w:w="1871"/>
-            <w:shd w:val="clear" w:fill="0B1B3A"/>
+            <w:tcW w:type="dxa" w:w="2160"/>
           </w:tcPr>
           <w:p>
-            <w:r/>
             <w:r>
               <w:rPr>
                 <w:b/>
-                <w:color w:val="FFFFFF"/>
+                <w:color w:val="0B1B3A"/>
                 <w:sz w:val="19"/>
               </w:rPr>
               <w:t>Địa chỉ</w:t>
@@ -154,15 +98,13 @@
         </w:tc>
         <w:tc>
           <w:tcPr>
-            <w:tcW w:type="dxa" w:w="1814"/>
-            <w:shd w:val="clear" w:fill="0B1B3A"/>
+            <w:tcW w:type="dxa" w:w="2160"/>
           </w:tcPr>
           <w:p>
-            <w:r/>
             <w:r>
               <w:rPr>
                 <w:b/>
-                <w:color w:val="FFFFFF"/>
+                <w:color w:val="0B1B3A"/>
                 <w:sz w:val="19"/>
               </w:rPr>
               <w:t>Dành cho</w:t>
@@ -171,15 +113,13 @@
         </w:tc>
         <w:tc>
           <w:tcPr>
-            <w:tcW w:type="dxa" w:w="3969"/>
-            <w:shd w:val="clear" w:fill="0B1B3A"/>
+            <w:tcW w:type="dxa" w:w="2160"/>
           </w:tcPr>
           <w:p>
-            <w:r/>
             <w:r>
               <w:rPr>
                 <w:b/>
-                <w:color w:val="FFFFFF"/>
+                <w:color w:val="0B1B3A"/>
                 <w:sz w:val="19"/>
               </w:rPr>
               <w:t>Nội dung chính</w:t>
@@ -190,12 +130,12 @@
       <w:tr>
         <w:tc>
           <w:tcPr>
-            <w:tcW w:type="dxa" w:w="1814"/>
+            <w:tcW w:type="dxa" w:w="2160"/>
           </w:tcPr>
           <w:p>
-            <w:r/>
             <w:r>
               <w:rPr>
+                <w:b w:val="0"/>
                 <w:sz w:val="19"/>
               </w:rPr>
               <w:t>English Arena</w:t>
@@ -204,12 +144,12 @@
         </w:tc>
         <w:tc>
           <w:tcPr>
-            <w:tcW w:type="dxa" w:w="1871"/>
+            <w:tcW w:type="dxa" w:w="2160"/>
           </w:tcPr>
           <w:p>
-            <w:r/>
             <w:r>
               <w:rPr>
+                <w:b w:val="0"/>
                 <w:sz w:val="19"/>
               </w:rPr>
               <w:t>ea.vieschool.com</w:t>
@@ -218,12 +158,12 @@
         </w:tc>
         <w:tc>
           <w:tcPr>
-            <w:tcW w:type="dxa" w:w="1814"/>
+            <w:tcW w:type="dxa" w:w="2160"/>
           </w:tcPr>
           <w:p>
-            <w:r/>
             <w:r>
               <w:rPr>
+                <w:b w:val="0"/>
                 <w:sz w:val="19"/>
               </w:rPr>
               <w:t>Học sinh lớp 1-5 (lộ trình 6-12)</w:t>
@@ -232,15 +172,15 @@
         </w:tc>
         <w:tc>
           <w:tcPr>
-            <w:tcW w:type="dxa" w:w="3969"/>
+            <w:tcW w:type="dxa" w:w="2160"/>
           </w:tcPr>
           <w:p>
-            <w:r/>
             <w:r>
               <w:rPr>
+                <w:b w:val="0"/>
                 <w:sz w:val="19"/>
               </w:rPr>
-              <w:t>Luyện tiếng Anh bám SGK Global Success qua hành trình phiêu lưu 5 vùng đất cùng mascot Bé Heo. 1100+ từ vựng có hình minh họa và giải thích tiếng Việt, 4 vòng luyện: nghe, đọc, ghép cặp, phát âm chấm điểm.</w:t>
+              <w:t>Luyện Tiếng Anh, Toán và Khoa học tiếng Anh bám SGK Global Success</w:t>
             </w:r>
           </w:p>
         </w:tc>
@@ -248,13 +188,12 @@
       <w:tr>
         <w:tc>
           <w:tcPr>
-            <w:tcW w:type="dxa" w:w="1814"/>
-            <w:shd w:val="clear" w:fill="F4F6FA"/>
+            <w:tcW w:type="dxa" w:w="2160"/>
           </w:tcPr>
           <w:p>
-            <w:r/>
             <w:r>
               <w:rPr>
+                <w:b w:val="0"/>
                 <w:sz w:val="19"/>
               </w:rPr>
               <w:t>Công cụ số Giáo viên</w:t>
@@ -263,13 +202,12 @@
         </w:tc>
         <w:tc>
           <w:tcPr>
-            <w:tcW w:type="dxa" w:w="1871"/>
-            <w:shd w:val="clear" w:fill="F4F6FA"/>
+            <w:tcW w:type="dxa" w:w="2160"/>
           </w:tcPr>
           <w:p>
-            <w:r/>
             <w:r>
               <w:rPr>
+                <w:b w:val="0"/>
                 <w:sz w:val="19"/>
               </w:rPr>
               <w:t>congcuso.vieschool.com</w:t>
@@ -278,13 +216,12 @@
         </w:tc>
         <w:tc>
           <w:tcPr>
-            <w:tcW w:type="dxa" w:w="1814"/>
-            <w:shd w:val="clear" w:fill="F4F6FA"/>
+            <w:tcW w:type="dxa" w:w="2160"/>
           </w:tcPr>
           <w:p>
-            <w:r/>
             <w:r>
               <w:rPr>
+                <w:b w:val="0"/>
                 <w:sz w:val="19"/>
               </w:rPr>
               <w:t>Giáo viên các cấp</w:t>
@@ -293,16 +230,15 @@
         </w:tc>
         <w:tc>
           <w:tcPr>
-            <w:tcW w:type="dxa" w:w="3969"/>
-            <w:shd w:val="clear" w:fill="F4F6FA"/>
+            <w:tcW w:type="dxa" w:w="2160"/>
           </w:tcPr>
           <w:p>
-            <w:r/>
             <w:r>
               <w:rPr>
+                <w:b w:val="0"/>
                 <w:sz w:val="19"/>
               </w:rPr>
-              <w:t>12 công cụ biên soạn học liệu theo CTGDPT 2018 (gồm các sửa đổi của Thông tư 17/2025 cho Lịch sử, Địa lí, Giáo dục công dân): ngân hàng câu hỏi, ma trận đề, đề kiểm tra có công thức toán Word-native, kế hoạch bài dạy, phiếu học tập - xuất DOCX/PDF đúng format nhà trường.</w:t>
+              <w:t>12 công cụ biên soạn học liệu theo CTGDPT 2018</w:t>
             </w:r>
           </w:p>
         </w:tc>
@@ -310,12 +246,12 @@
       <w:tr>
         <w:tc>
           <w:tcPr>
-            <w:tcW w:type="dxa" w:w="1814"/>
+            <w:tcW w:type="dxa" w:w="2160"/>
           </w:tcPr>
           <w:p>
-            <w:r/>
             <w:r>
               <w:rPr>
+                <w:b w:val="0"/>
                 <w:sz w:val="19"/>
               </w:rPr>
               <w:t>Sổ Chủ Nhiệm Số</w:t>
@@ -324,12 +260,12 @@
         </w:tc>
         <w:tc>
           <w:tcPr>
-            <w:tcW w:type="dxa" w:w="1871"/>
+            <w:tcW w:type="dxa" w:w="2160"/>
           </w:tcPr>
           <w:p>
-            <w:r/>
             <w:r>
               <w:rPr>
+                <w:b w:val="0"/>
                 <w:sz w:val="19"/>
               </w:rPr>
               <w:t>sochunhiem.vieschool.com</w:t>
@@ -338,12 +274,12 @@
         </w:tc>
         <w:tc>
           <w:tcPr>
-            <w:tcW w:type="dxa" w:w="1814"/>
+            <w:tcW w:type="dxa" w:w="2160"/>
           </w:tcPr>
           <w:p>
-            <w:r/>
             <w:r>
               <w:rPr>
+                <w:b w:val="0"/>
                 <w:sz w:val="19"/>
               </w:rPr>
               <w:t>Nhà trường, GVCN, BGH</w:t>
@@ -352,61 +288,100 @@
         </w:tc>
         <w:tc>
           <w:tcPr>
-            <w:tcW w:type="dxa" w:w="3969"/>
+            <w:tcW w:type="dxa" w:w="2160"/>
           </w:tcPr>
           <w:p>
-            <w:r/>
             <w:r>
               <w:rPr>
+                <w:b w:val="0"/>
                 <w:sz w:val="19"/>
               </w:rPr>
-              <w:t>Số hóa công tác chủ nhiệm theo Điều lệ trường mới nhất (Thông tư 15/2026/TT-BGDĐT): điểm danh, hạnh kiểm, sổ điểm, nhận xét định kỳ, báo cáo Ban Giám Hiệu. Dữ liệu lớp đồng bộ - giáo viên chỉ nhập một lần.</w:t>
+              <w:t>Số hóa công tác chủ nhiệm theo Điều lệ trường mới nhất</w:t>
             </w:r>
           </w:p>
         </w:tc>
       </w:tr>
     </w:tbl>
     <w:p>
-      <w:pPr>
-        <w:spacing w:after="40"/>
-      </w:pPr>
+      <w:r>
+        <w:rPr>
+          <w:sz w:val="22"/>
+        </w:rPr>
+      </w:r>
+    </w:p>
+    <w:p>
+      <w:r>
+        <w:rPr>
+          <w:b/>
+          <w:sz w:val="22"/>
+        </w:rPr>
+        <w:t>English Arena - sản phẩm chủ lực:</w:t>
+      </w:r>
     </w:p>
     <w:p>
       <w:pPr>
-        <w:spacing w:before="280" w:after="120"/>
+        <w:pStyle w:val="ListBullet"/>
       </w:pPr>
+      <w:r>
+        <w:t>Ngân hàng 11.400+ câu hỏi bám SGK Global Success lớp 1-5 - mỗi câu kèm đáp án và giải thích tiếng Việt đã kiểm duyệt.</w:t>
+      </w:r>
+    </w:p>
+    <w:p>
+      <w:pPr>
+        <w:pStyle w:val="ListBullet"/>
+      </w:pPr>
+      <w:r>
+        <w:t>270 đề thi chuẩn theo format đề IOE - số câu và thời gian chỉnh riêng từng khối. Ôn luyện có đồng hồ đo giờ làm bài, câu sai tự đưa vào hàng đợi ôn lại.</w:t>
+      </w:r>
+    </w:p>
+    <w:p>
+      <w:pPr>
+        <w:pStyle w:val="ListBullet"/>
+      </w:pPr>
+      <w:r>
+        <w:t>3 môn luyện bằng tiếng Anh trong cùng app: Tiếng Anh, Toán tiếng Anh, Khoa học tiếng Anh - đúng nhu cầu luyện IOE và Violympic.</w:t>
+      </w:r>
+    </w:p>
+    <w:p>
+      <w:pPr>
+        <w:pStyle w:val="ListBullet"/>
+      </w:pPr>
+      <w:r>
+        <w:t>1.400+ hình minh họa và 470 bài nghe có transcript - toàn bộ tài sản hình ảnh khai báo bản quyền rõ ràng, không dùng nội dung bên thứ ba chưa được cấp phép.</w:t>
+      </w:r>
+    </w:p>
+    <w:p>
+      <w:pPr>
+        <w:pStyle w:val="ListBullet"/>
+      </w:pPr>
+      <w:r>
+        <w:t>Thi đua lành mạnh: bảng xếp hạng tuần, đấu trường 1v1, sao - huy hiệu - chuỗi ngày học. Vào lớp bằng mã 6 ký tự. Không quảng cáo, không chat.</w:t>
+      </w:r>
+    </w:p>
+    <w:p>
+      <w:r>
+        <w:rPr>
+          <w:b/>
+          <w:color w:val="0B1B3A"/>
+          <w:sz w:val="36"/>
+        </w:rPr>
+        <w:t>2. So sánh với các giải pháp trên thị trường</w:t>
+      </w:r>
+    </w:p>
+    <w:p>
+      <w:r>
+        <w:rPr>
+          <w:sz w:val="22"/>
+        </w:rPr>
+        <w:t>Bảng so sánh trung thực - chúng tôi liệt kê cả điểm đối thủ làm tốt hơn để nhà trường đánh giá khách quan.</w:t>
+      </w:r>
+    </w:p>
+    <w:p>
       <w:r>
         <w:rPr>
           <w:b/>
           <w:color w:val="0B1B3A"/>
           <w:sz w:val="28"/>
-        </w:rPr>
-        <w:t>2. So sánh với các giải pháp trên thị trường</w:t>
-      </w:r>
-    </w:p>
-    <w:p>
-      <w:pPr>
-        <w:spacing w:after="120"/>
-      </w:pPr>
-      <w:r>
-        <w:rPr>
-          <w:b w:val="0"/>
-          <w:i/>
-          <w:color w:val="556070"/>
-          <w:sz w:val="21"/>
-        </w:rPr>
-        <w:t>Bảng so sánh trung thực - chúng tôi liệt kê cả điểm đối thủ làm tốt hơn để nhà trường đánh giá khách quan.</w:t>
-      </w:r>
-    </w:p>
-    <w:p>
-      <w:pPr>
-        <w:spacing w:before="280" w:after="120"/>
-      </w:pPr>
-      <w:r>
-        <w:rPr>
-          <w:b/>
-          <w:color w:val="0B1B3A"/>
-          <w:sz w:val="24"/>
         </w:rPr>
         <w:t>2.1 English Arena (luyện tiếng Anh)</w:t>
       </w:r>
@@ -415,27 +390,24 @@
       <w:tblPr>
         <w:tblStyle w:val="TableGrid"/>
         <w:tblW w:type="auto" w:w="0"/>
-        <w:jc w:val="center"/>
         <w:tblLook w:firstColumn="1" w:firstRow="1" w:lastColumn="0" w:lastRow="0" w:noHBand="0" w:noVBand="1" w:val="04A0"/>
       </w:tblPr>
       <w:tblGrid>
-        <w:gridCol w:w="2436"/>
-        <w:gridCol w:w="2436"/>
-        <w:gridCol w:w="2436"/>
-        <w:gridCol w:w="2436"/>
+        <w:gridCol w:w="2160"/>
+        <w:gridCol w:w="2160"/>
+        <w:gridCol w:w="2160"/>
+        <w:gridCol w:w="2160"/>
       </w:tblGrid>
       <w:tr>
         <w:tc>
           <w:tcPr>
-            <w:tcW w:type="dxa" w:w="1814"/>
-            <w:shd w:val="clear" w:fill="0B1B3A"/>
+            <w:tcW w:type="dxa" w:w="2160"/>
           </w:tcPr>
           <w:p>
-            <w:r/>
             <w:r>
               <w:rPr>
                 <w:b/>
-                <w:color w:val="FFFFFF"/>
+                <w:color w:val="0B1B3A"/>
                 <w:sz w:val="19"/>
               </w:rPr>
               <w:t>Tiêu chí</w:t>
@@ -444,15 +416,13 @@
         </w:tc>
         <w:tc>
           <w:tcPr>
-            <w:tcW w:type="dxa" w:w="2608"/>
-            <w:shd w:val="clear" w:fill="0B1B3A"/>
+            <w:tcW w:type="dxa" w:w="2160"/>
           </w:tcPr>
           <w:p>
-            <w:r/>
             <w:r>
               <w:rPr>
                 <w:b/>
-                <w:color w:val="FFFFFF"/>
+                <w:color w:val="0B1B3A"/>
                 <w:sz w:val="19"/>
               </w:rPr>
               <w:t>VieSchool English Arena</w:t>
@@ -461,15 +431,13 @@
         </w:tc>
         <w:tc>
           <w:tcPr>
-            <w:tcW w:type="dxa" w:w="2608"/>
-            <w:shd w:val="clear" w:fill="0B1B3A"/>
+            <w:tcW w:type="dxa" w:w="2160"/>
           </w:tcPr>
           <w:p>
-            <w:r/>
             <w:r>
               <w:rPr>
                 <w:b/>
-                <w:color w:val="FFFFFF"/>
+                <w:color w:val="0B1B3A"/>
                 <w:sz w:val="19"/>
               </w:rPr>
               <w:t>App quốc tế (Duolingo, Khan Kids)</w:t>
@@ -478,15 +446,13 @@
         </w:tc>
         <w:tc>
           <w:tcPr>
-            <w:tcW w:type="dxa" w:w="2608"/>
-            <w:shd w:val="clear" w:fill="0B1B3A"/>
+            <w:tcW w:type="dxa" w:w="2160"/>
           </w:tcPr>
           <w:p>
-            <w:r/>
             <w:r>
               <w:rPr>
                 <w:b/>
-                <w:color w:val="FFFFFF"/>
+                <w:color w:val="0B1B3A"/>
                 <w:sz w:val="19"/>
               </w:rPr>
               <w:t>App nội địa (Monkey, VioEdu)</w:t>
@@ -497,12 +463,12 @@
       <w:tr>
         <w:tc>
           <w:tcPr>
-            <w:tcW w:type="dxa" w:w="1814"/>
+            <w:tcW w:type="dxa" w:w="2160"/>
           </w:tcPr>
           <w:p>
-            <w:r/>
             <w:r>
               <w:rPr>
+                <w:b w:val="0"/>
                 <w:sz w:val="19"/>
               </w:rPr>
               <w:t>Bám SGK Việt Nam</w:t>
@@ -511,26 +477,26 @@
         </w:tc>
         <w:tc>
           <w:tcPr>
-            <w:tcW w:type="dxa" w:w="2608"/>
+            <w:tcW w:type="dxa" w:w="2160"/>
           </w:tcPr>
           <w:p>
-            <w:r/>
             <w:r>
               <w:rPr>
+                <w:b w:val="0"/>
                 <w:sz w:val="19"/>
               </w:rPr>
-              <w:t>Bám trọn Global Success lớp 1-5, mỗi từ gắn đúng bài đang học</w:t>
+              <w:t>Trọn Global Success lớp 1-5, mỗi câu kèm giải thích tiếng Việt</w:t>
             </w:r>
           </w:p>
         </w:tc>
         <w:tc>
           <w:tcPr>
-            <w:tcW w:type="dxa" w:w="2608"/>
+            <w:tcW w:type="dxa" w:w="2160"/>
           </w:tcPr>
           <w:p>
-            <w:r/>
             <w:r>
               <w:rPr>
+                <w:b w:val="0"/>
                 <w:sz w:val="19"/>
               </w:rPr>
               <w:t>Không theo chương trình VN</w:t>
@@ -539,15 +505,15 @@
         </w:tc>
         <w:tc>
           <w:tcPr>
-            <w:tcW w:type="dxa" w:w="2608"/>
+            <w:tcW w:type="dxa" w:w="2160"/>
           </w:tcPr>
           <w:p>
-            <w:r/>
             <w:r>
               <w:rPr>
+                <w:b w:val="0"/>
                 <w:sz w:val="19"/>
               </w:rPr>
-              <w:t>Theo chương trình chung, không bám từng unit SGK</w:t>
+              <w:t>Theo chương trình chung, không bám từng unit</w:t>
             </w:r>
           </w:p>
         </w:tc>
@@ -555,13 +521,12 @@
       <w:tr>
         <w:tc>
           <w:tcPr>
-            <w:tcW w:type="dxa" w:w="1814"/>
-            <w:shd w:val="clear" w:fill="F4F6FA"/>
+            <w:tcW w:type="dxa" w:w="2160"/>
           </w:tcPr>
           <w:p>
-            <w:r/>
             <w:r>
               <w:rPr>
+                <w:b w:val="0"/>
                 <w:sz w:val="19"/>
               </w:rPr>
               <w:t>Trải nghiệm trẻ em</w:t>
@@ -570,28 +535,26 @@
         </w:tc>
         <w:tc>
           <w:tcPr>
-            <w:tcW w:type="dxa" w:w="2608"/>
-            <w:shd w:val="clear" w:fill="F4F6FA"/>
+            <w:tcW w:type="dxa" w:w="2160"/>
           </w:tcPr>
           <w:p>
-            <w:r/>
             <w:r>
               <w:rPr>
+                <w:b w:val="0"/>
                 <w:sz w:val="19"/>
               </w:rPr>
-              <w:t>Thế giới phiêu lưu, mascot, sao - huy hiệu - chuỗi ngày; UI nghiên cứu riêng cho 6-11 tuổi</w:t>
+              <w:t>Thế giới phiêu lưu, mascot, sao - huy hiệu - sticker</w:t>
             </w:r>
           </w:p>
         </w:tc>
         <w:tc>
           <w:tcPr>
-            <w:tcW w:type="dxa" w:w="2608"/>
-            <w:shd w:val="clear" w:fill="F4F6FA"/>
+            <w:tcW w:type="dxa" w:w="2160"/>
           </w:tcPr>
           <w:p>
-            <w:r/>
             <w:r>
               <w:rPr>
+                <w:b w:val="0"/>
                 <w:sz w:val="19"/>
               </w:rPr>
               <w:t>Rất tốt - animation, đồ họa đầu tư lớn</w:t>
@@ -600,13 +563,12 @@
         </w:tc>
         <w:tc>
           <w:tcPr>
-            <w:tcW w:type="dxa" w:w="2608"/>
-            <w:shd w:val="clear" w:fill="F4F6FA"/>
+            <w:tcW w:type="dxa" w:w="2160"/>
           </w:tcPr>
           <w:p>
-            <w:r/>
             <w:r>
               <w:rPr>
+                <w:b w:val="0"/>
                 <w:sz w:val="19"/>
               </w:rPr>
               <w:t>Đa số là form trắc nghiệm, UI khô</w:t>
@@ -617,57 +579,57 @@
       <w:tr>
         <w:tc>
           <w:tcPr>
-            <w:tcW w:type="dxa" w:w="1814"/>
+            <w:tcW w:type="dxa" w:w="2160"/>
           </w:tcPr>
           <w:p>
-            <w:r/>
             <w:r>
               <w:rPr>
+                <w:b w:val="0"/>
                 <w:sz w:val="19"/>
               </w:rPr>
-              <w:t>Kỹ năng luyện</w:t>
+              <w:t>Môn luyện</w:t>
             </w:r>
           </w:p>
         </w:tc>
         <w:tc>
           <w:tcPr>
-            <w:tcW w:type="dxa" w:w="2608"/>
+            <w:tcW w:type="dxa" w:w="2160"/>
           </w:tcPr>
           <w:p>
-            <w:r/>
             <w:r>
               <w:rPr>
+                <w:b w:val="0"/>
                 <w:sz w:val="19"/>
               </w:rPr>
-              <w:t>Nghe - đọc - ghép cặp - phát âm có chấm điểm</w:t>
+              <w:t>Tiếng Anh + Toán tiếng Anh + Khoa học tiếng Anh</w:t>
             </w:r>
           </w:p>
         </w:tc>
         <w:tc>
           <w:tcPr>
-            <w:tcW w:type="dxa" w:w="2608"/>
+            <w:tcW w:type="dxa" w:w="2160"/>
           </w:tcPr>
           <w:p>
-            <w:r/>
             <w:r>
               <w:rPr>
+                <w:b w:val="0"/>
                 <w:sz w:val="19"/>
               </w:rPr>
-              <w:t>Nghe - đọc - nói (phát âm chấm tốt)</w:t>
+              <w:t>Chủ yếu tiếng Anh/ngôn ngữ</w:t>
             </w:r>
           </w:p>
         </w:tc>
         <w:tc>
           <w:tcPr>
-            <w:tcW w:type="dxa" w:w="2608"/>
+            <w:tcW w:type="dxa" w:w="2160"/>
           </w:tcPr>
           <w:p>
-            <w:r/>
             <w:r>
               <w:rPr>
+                <w:b w:val="0"/>
                 <w:sz w:val="19"/>
               </w:rPr>
-              <w:t>Chủ yếu đọc/nghe trắc nghiệm</w:t>
+              <w:t>Tách nhiều app/gói cho từng môn</w:t>
             </w:r>
           </w:p>
         </w:tc>
@@ -675,13 +637,70 @@
       <w:tr>
         <w:tc>
           <w:tcPr>
-            <w:tcW w:type="dxa" w:w="1814"/>
-            <w:shd w:val="clear" w:fill="F4F6FA"/>
+            <w:tcW w:type="dxa" w:w="2160"/>
           </w:tcPr>
           <w:p>
-            <w:r/>
             <w:r>
               <w:rPr>
+                <w:b w:val="0"/>
+                <w:sz w:val="19"/>
+              </w:rPr>
+              <w:t>Đề thi và ôn luyện</w:t>
+            </w:r>
+          </w:p>
+        </w:tc>
+        <w:tc>
+          <w:tcPr>
+            <w:tcW w:type="dxa" w:w="2160"/>
+          </w:tcPr>
+          <w:p>
+            <w:r>
+              <w:rPr>
+                <w:b w:val="0"/>
+                <w:sz w:val="19"/>
+              </w:rPr>
+              <w:t>270 đề thi chuẩn theo khối + luyện đề có đồng hồ đo giờ + ôn câu sai</w:t>
+            </w:r>
+          </w:p>
+        </w:tc>
+        <w:tc>
+          <w:tcPr>
+            <w:tcW w:type="dxa" w:w="2160"/>
+          </w:tcPr>
+          <w:p>
+            <w:r>
+              <w:rPr>
+                <w:b w:val="0"/>
+                <w:sz w:val="19"/>
+              </w:rPr>
+              <w:t>Không có format đề VN</w:t>
+            </w:r>
+          </w:p>
+        </w:tc>
+        <w:tc>
+          <w:tcPr>
+            <w:tcW w:type="dxa" w:w="2160"/>
+          </w:tcPr>
+          <w:p>
+            <w:r>
+              <w:rPr>
+                <w:b w:val="0"/>
+                <w:sz w:val="19"/>
+              </w:rPr>
+              <w:t>Có thi thử, ít cá nhân hóa ôn sai</w:t>
+            </w:r>
+          </w:p>
+        </w:tc>
+      </w:tr>
+      <w:tr>
+        <w:tc>
+          <w:tcPr>
+            <w:tcW w:type="dxa" w:w="2160"/>
+          </w:tcPr>
+          <w:p>
+            <w:r>
+              <w:rPr>
+                <w:b w:val="0"/>
                 <w:sz w:val="19"/>
               </w:rPr>
               <w:t>Mô hình trường học</w:t>
@@ -690,28 +709,26 @@
         </w:tc>
         <w:tc>
           <w:tcPr>
-            <w:tcW w:type="dxa" w:w="2608"/>
-            <w:shd w:val="clear" w:fill="F4F6FA"/>
+            <w:tcW w:type="dxa" w:w="2160"/>
           </w:tcPr>
           <w:p>
-            <w:r/>
             <w:r>
               <w:rPr>
+                <w:b w:val="0"/>
                 <w:sz w:val="19"/>
               </w:rPr>
-              <w:t>Trường cấp tài khoản, GV quản lý lớp, báo cáo theo lớp</w:t>
+              <w:t>Trường cấp tài khoản, GV quản lý lớp, báo cáo</w:t>
             </w:r>
           </w:p>
         </w:tc>
         <w:tc>
           <w:tcPr>
-            <w:tcW w:type="dxa" w:w="2608"/>
-            <w:shd w:val="clear" w:fill="F4F6FA"/>
+            <w:tcW w:type="dxa" w:w="2160"/>
           </w:tcPr>
           <w:p>
-            <w:r/>
             <w:r>
               <w:rPr>
+                <w:b w:val="0"/>
                 <w:sz w:val="19"/>
               </w:rPr>
               <w:t>Không có quản lý lớp theo trường VN</w:t>
@@ -720,13 +737,12 @@
         </w:tc>
         <w:tc>
           <w:tcPr>
-            <w:tcW w:type="dxa" w:w="2608"/>
-            <w:shd w:val="clear" w:fill="F4F6FA"/>
+            <w:tcW w:type="dxa" w:w="2160"/>
           </w:tcPr>
           <w:p>
-            <w:r/>
             <w:r>
               <w:rPr>
+                <w:b w:val="0"/>
                 <w:sz w:val="19"/>
               </w:rPr>
               <w:t>Một số có, thường phức tạp</w:t>
@@ -737,12 +753,12 @@
       <w:tr>
         <w:tc>
           <w:tcPr>
-            <w:tcW w:type="dxa" w:w="1814"/>
+            <w:tcW w:type="dxa" w:w="2160"/>
           </w:tcPr>
           <w:p>
-            <w:r/>
             <w:r>
               <w:rPr>
+                <w:b w:val="0"/>
                 <w:sz w:val="19"/>
               </w:rPr>
               <w:t>Chi phí</w:t>
@@ -751,26 +767,26 @@
         </w:tc>
         <w:tc>
           <w:tcPr>
-            <w:tcW w:type="dxa" w:w="2608"/>
+            <w:tcW w:type="dxa" w:w="2160"/>
           </w:tcPr>
           <w:p>
-            <w:r/>
             <w:r>
               <w:rPr>
+                <w:b w:val="0"/>
                 <w:sz w:val="19"/>
               </w:rPr>
-              <w:t>Miễn phí chơi thử; gói gia đình và gói trường rẻ hơn đáng kể</w:t>
+              <w:t>Miễn phí chơi thử; gói gia đình và gói trường</w:t>
             </w:r>
           </w:p>
         </w:tc>
         <w:tc>
           <w:tcPr>
-            <w:tcW w:type="dxa" w:w="2608"/>
+            <w:tcW w:type="dxa" w:w="2160"/>
           </w:tcPr>
           <w:p>
-            <w:r/>
             <w:r>
               <w:rPr>
+                <w:b w:val="0"/>
                 <w:sz w:val="19"/>
               </w:rPr>
               <w:t>Đắt (thu bằng USD)</w:t>
@@ -779,12 +795,12 @@
         </w:tc>
         <w:tc>
           <w:tcPr>
-            <w:tcW w:type="dxa" w:w="2608"/>
+            <w:tcW w:type="dxa" w:w="2160"/>
           </w:tcPr>
           <w:p>
-            <w:r/>
             <w:r>
               <w:rPr>
+                <w:b w:val="0"/>
                 <w:sz w:val="19"/>
               </w:rPr>
               <w:t>Trung bình</w:t>
@@ -795,13 +811,12 @@
       <w:tr>
         <w:tc>
           <w:tcPr>
-            <w:tcW w:type="dxa" w:w="1814"/>
-            <w:shd w:val="clear" w:fill="F4F6FA"/>
+            <w:tcW w:type="dxa" w:w="2160"/>
           </w:tcPr>
           <w:p>
-            <w:r/>
             <w:r>
               <w:rPr>
+                <w:b w:val="0"/>
                 <w:sz w:val="19"/>
               </w:rPr>
               <w:t>Điểm yếu của chúng tôi</w:t>
@@ -810,15 +825,26 @@
         </w:tc>
         <w:tc>
           <w:tcPr>
-            <w:tcW w:type="dxa" w:w="2608"/>
-            <w:shd w:val="clear" w:fill="F4F6FA"/>
+            <w:tcW w:type="dxa" w:w="2160"/>
           </w:tcPr>
           <w:p>
             <w:r>
-              <w:t>Chỉ tiếng Anh, hiện mới phủ lớp 1-5; vốn từ còn ít hơn các app nội địa lâu năm</w:t>
+              <w:rPr>
+                <w:b w:val="0"/>
+                <w:sz w:val="19"/>
+              </w:rPr>
+              <w:t>Mới phủ lớp 1-5 (lộ trình 6-12); vốn từ nhỏ hơn app quốc tế</w:t>
             </w:r>
+          </w:p>
+        </w:tc>
+        <w:tc>
+          <w:tcPr>
+            <w:tcW w:type="dxa" w:w="2160"/>
+          </w:tcPr>
+          <w:p>
             <w:r>
               <w:rPr>
+                <w:b w:val="0"/>
                 <w:sz w:val="19"/>
               </w:rPr>
             </w:r>
@@ -826,27 +852,12 @@
         </w:tc>
         <w:tc>
           <w:tcPr>
-            <w:tcW w:type="dxa" w:w="2608"/>
-            <w:shd w:val="clear" w:fill="F4F6FA"/>
+            <w:tcW w:type="dxa" w:w="2160"/>
           </w:tcPr>
           <w:p>
-            <w:r/>
             <w:r>
               <w:rPr>
-                <w:sz w:val="19"/>
-              </w:rPr>
-            </w:r>
-          </w:p>
-        </w:tc>
-        <w:tc>
-          <w:tcPr>
-            <w:tcW w:type="dxa" w:w="2608"/>
-            <w:shd w:val="clear" w:fill="F4F6FA"/>
-          </w:tcPr>
-          <w:p>
-            <w:r/>
-            <w:r>
-              <w:rPr>
+                <w:b w:val="0"/>
                 <w:sz w:val="19"/>
               </w:rPr>
             </w:r>
@@ -855,19 +866,11 @@
       </w:tr>
     </w:tbl>
     <w:p>
-      <w:pPr>
-        <w:spacing w:after="40"/>
-      </w:pPr>
-    </w:p>
-    <w:p>
-      <w:pPr>
-        <w:spacing w:before="280" w:after="120"/>
-      </w:pPr>
       <w:r>
         <w:rPr>
           <w:b/>
           <w:color w:val="0B1B3A"/>
-          <w:sz w:val="24"/>
+          <w:sz w:val="28"/>
         </w:rPr>
         <w:t>2.2 Công cụ số Giáo viên (TVC360)</w:t>
       </w:r>
@@ -876,27 +879,24 @@
       <w:tblPr>
         <w:tblStyle w:val="TableGrid"/>
         <w:tblW w:type="auto" w:w="0"/>
-        <w:jc w:val="center"/>
         <w:tblLook w:firstColumn="1" w:firstRow="1" w:lastColumn="0" w:lastRow="0" w:noHBand="0" w:noVBand="1" w:val="04A0"/>
       </w:tblPr>
       <w:tblGrid>
-        <w:gridCol w:w="2436"/>
-        <w:gridCol w:w="2436"/>
-        <w:gridCol w:w="2436"/>
-        <w:gridCol w:w="2436"/>
+        <w:gridCol w:w="2160"/>
+        <w:gridCol w:w="2160"/>
+        <w:gridCol w:w="2160"/>
+        <w:gridCol w:w="2160"/>
       </w:tblGrid>
       <w:tr>
         <w:tc>
           <w:tcPr>
-            <w:tcW w:type="dxa" w:w="1814"/>
-            <w:shd w:val="clear" w:fill="0B1B3A"/>
+            <w:tcW w:type="dxa" w:w="2160"/>
           </w:tcPr>
           <w:p>
-            <w:r/>
             <w:r>
               <w:rPr>
                 <w:b/>
-                <w:color w:val="FFFFFF"/>
+                <w:color w:val="0B1B3A"/>
                 <w:sz w:val="19"/>
               </w:rPr>
               <w:t>Tiêu chí</w:t>
@@ -905,15 +905,13 @@
         </w:tc>
         <w:tc>
           <w:tcPr>
-            <w:tcW w:type="dxa" w:w="2608"/>
-            <w:shd w:val="clear" w:fill="0B1B3A"/>
+            <w:tcW w:type="dxa" w:w="2160"/>
           </w:tcPr>
           <w:p>
-            <w:r/>
             <w:r>
               <w:rPr>
                 <w:b/>
-                <w:color w:val="FFFFFF"/>
+                <w:color w:val="0B1B3A"/>
                 <w:sz w:val="19"/>
               </w:rPr>
               <w:t>TVC360</w:t>
@@ -922,15 +920,13 @@
         </w:tc>
         <w:tc>
           <w:tcPr>
-            <w:tcW w:type="dxa" w:w="2608"/>
-            <w:shd w:val="clear" w:fill="0B1B3A"/>
+            <w:tcW w:type="dxa" w:w="2160"/>
           </w:tcPr>
           <w:p>
-            <w:r/>
             <w:r>
               <w:rPr>
                 <w:b/>
-                <w:color w:val="FFFFFF"/>
+                <w:color w:val="0B1B3A"/>
                 <w:sz w:val="19"/>
               </w:rPr>
               <w:t>MagicSchool (Mỹ)</w:t>
@@ -939,15 +935,13 @@
         </w:tc>
         <w:tc>
           <w:tcPr>
-            <w:tcW w:type="dxa" w:w="2608"/>
-            <w:shd w:val="clear" w:fill="0B1B3A"/>
+            <w:tcW w:type="dxa" w:w="2160"/>
           </w:tcPr>
           <w:p>
-            <w:r/>
             <w:r>
               <w:rPr>
                 <w:b/>
-                <w:color w:val="FFFFFF"/>
+                <w:color w:val="0B1B3A"/>
                 <w:sz w:val="19"/>
               </w:rPr>
               <w:t>Azota</w:t>
@@ -958,12 +952,12 @@
       <w:tr>
         <w:tc>
           <w:tcPr>
-            <w:tcW w:type="dxa" w:w="1814"/>
+            <w:tcW w:type="dxa" w:w="2160"/>
           </w:tcPr>
           <w:p>
-            <w:r/>
             <w:r>
               <w:rPr>
+                <w:b w:val="0"/>
                 <w:sz w:val="19"/>
               </w:rPr>
               <w:t>Chương trình áp dụng</w:t>
@@ -972,26 +966,26 @@
         </w:tc>
         <w:tc>
           <w:tcPr>
-            <w:tcW w:type="dxa" w:w="2608"/>
+            <w:tcW w:type="dxa" w:w="2160"/>
           </w:tcPr>
           <w:p>
-            <w:r/>
             <w:r>
               <w:rPr>
+                <w:b w:val="0"/>
                 <w:sz w:val="19"/>
               </w:rPr>
-              <w:t>CTGDPT 2018 (gồm sửa đổi của TT 17/2025 cho Lịch sử, Địa lí, GDCD), gắn mã yêu cầu cần đạt</w:t>
+              <w:t>CTGDPT 2018 (gồm sửa đổi của TT 17/2025 cho Lịch sử, Địa lí, GDCD), gắn mã YCCĐ</w:t>
             </w:r>
           </w:p>
         </w:tc>
         <w:tc>
           <w:tcPr>
-            <w:tcW w:type="dxa" w:w="2608"/>
+            <w:tcW w:type="dxa" w:w="2160"/>
           </w:tcPr>
           <w:p>
-            <w:r/>
             <w:r>
               <w:rPr>
+                <w:b w:val="0"/>
                 <w:sz w:val="19"/>
               </w:rPr>
               <w:t>Chuẩn Mỹ - không áp cho VN</w:t>
@@ -1000,12 +994,12 @@
         </w:tc>
         <w:tc>
           <w:tcPr>
-            <w:tcW w:type="dxa" w:w="2608"/>
+            <w:tcW w:type="dxa" w:w="2160"/>
           </w:tcPr>
           <w:p>
-            <w:r/>
             <w:r>
               <w:rPr>
+                <w:b w:val="0"/>
                 <w:sz w:val="19"/>
               </w:rPr>
               <w:t>Theo cấu trúc đề thi VN</w:t>
@@ -1016,13 +1010,12 @@
       <w:tr>
         <w:tc>
           <w:tcPr>
-            <w:tcW w:type="dxa" w:w="1814"/>
-            <w:shd w:val="clear" w:fill="F4F6FA"/>
+            <w:tcW w:type="dxa" w:w="2160"/>
           </w:tcPr>
           <w:p>
-            <w:r/>
             <w:r>
               <w:rPr>
+                <w:b w:val="0"/>
                 <w:sz w:val="19"/>
               </w:rPr>
               <w:t>Phạm vi công cụ</w:t>
@@ -1031,28 +1024,26 @@
         </w:tc>
         <w:tc>
           <w:tcPr>
-            <w:tcW w:type="dxa" w:w="2608"/>
-            <w:shd w:val="clear" w:fill="F4F6FA"/>
+            <w:tcW w:type="dxa" w:w="2160"/>
           </w:tcPr>
           <w:p>
-            <w:r/>
             <w:r>
               <w:rPr>
+                <w:b w:val="0"/>
                 <w:sz w:val="19"/>
               </w:rPr>
-              <w:t>12 công cụ: ngân hàng câu hỏi, ma trận, đề thi, KHBD, phiếu học tập</w:t>
+              <w:t>12 công cụ: ngân hàng câu hỏi, ma trận, đề thi, kế hoạch bài dạy</w:t>
             </w:r>
           </w:p>
         </w:tc>
         <w:tc>
           <w:tcPr>
-            <w:tcW w:type="dxa" w:w="2608"/>
-            <w:shd w:val="clear" w:fill="F4F6FA"/>
+            <w:tcW w:type="dxa" w:w="2160"/>
           </w:tcPr>
           <w:p>
-            <w:r/>
             <w:r>
               <w:rPr>
+                <w:b w:val="0"/>
                 <w:sz w:val="19"/>
               </w:rPr>
               <w:t>60+ công cụ nhưng toàn tiếng Anh, prompt Mỹ</w:t>
@@ -1061,13 +1052,12 @@
         </w:tc>
         <w:tc>
           <w:tcPr>
-            <w:tcW w:type="dxa" w:w="2608"/>
-            <w:shd w:val="clear" w:fill="F4F6FA"/>
+            <w:tcW w:type="dxa" w:w="2160"/>
           </w:tcPr>
           <w:p>
-            <w:r/>
             <w:r>
               <w:rPr>
+                <w:b w:val="0"/>
                 <w:sz w:val="19"/>
               </w:rPr>
               <w:t>Chấm điểm, ngân hàng đề - mạnh về thi cử</w:t>
@@ -1078,12 +1068,12 @@
       <w:tr>
         <w:tc>
           <w:tcPr>
-            <w:tcW w:type="dxa" w:w="1814"/>
+            <w:tcW w:type="dxa" w:w="2160"/>
           </w:tcPr>
           <w:p>
-            <w:r/>
             <w:r>
               <w:rPr>
+                <w:b w:val="0"/>
                 <w:sz w:val="19"/>
               </w:rPr>
               <w:t>Xuất tài liệu</w:t>
@@ -1092,12 +1082,12 @@
         </w:tc>
         <w:tc>
           <w:tcPr>
-            <w:tcW w:type="dxa" w:w="2608"/>
+            <w:tcW w:type="dxa" w:w="2160"/>
           </w:tcPr>
           <w:p>
-            <w:r/>
             <w:r>
               <w:rPr>
+                <w:b w:val="0"/>
                 <w:sz w:val="19"/>
               </w:rPr>
               <w:t>DOCX có công thức toán Word-native + PDF</w:t>
@@ -1106,12 +1096,12 @@
         </w:tc>
         <w:tc>
           <w:tcPr>
-            <w:tcW w:type="dxa" w:w="2608"/>
+            <w:tcW w:type="dxa" w:w="2160"/>
           </w:tcPr>
           <w:p>
-            <w:r/>
             <w:r>
               <w:rPr>
+                <w:b w:val="0"/>
                 <w:sz w:val="19"/>
               </w:rPr>
               <w:t>Text/copy-paste</w:t>
@@ -1120,15 +1110,15 @@
         </w:tc>
         <w:tc>
           <w:tcPr>
-            <w:tcW w:type="dxa" w:w="2608"/>
+            <w:tcW w:type="dxa" w:w="2160"/>
           </w:tcPr>
           <w:p>
-            <w:r/>
             <w:r>
               <w:rPr>
+                <w:b w:val="0"/>
                 <w:sz w:val="19"/>
               </w:rPr>
-              <w:t>DOCX/PDF</w:t>
+              <w:t>DOCX / PDF</w:t>
             </w:r>
           </w:p>
         </w:tc>
@@ -1136,13 +1126,12 @@
       <w:tr>
         <w:tc>
           <w:tcPr>
-            <w:tcW w:type="dxa" w:w="1814"/>
-            <w:shd w:val="clear" w:fill="F4F6FA"/>
+            <w:tcW w:type="dxa" w:w="2160"/>
           </w:tcPr>
           <w:p>
-            <w:r/>
             <w:r>
               <w:rPr>
+                <w:b w:val="0"/>
                 <w:sz w:val="19"/>
               </w:rPr>
               <w:t>Điểm yếu của chúng tôi</w:t>
@@ -1151,28 +1140,26 @@
         </w:tc>
         <w:tc>
           <w:tcPr>
-            <w:tcW w:type="dxa" w:w="2608"/>
-            <w:shd w:val="clear" w:fill="F4F6FA"/>
+            <w:tcW w:type="dxa" w:w="2160"/>
           </w:tcPr>
           <w:p>
-            <w:r/>
             <w:r>
               <w:rPr>
+                <w:b w:val="0"/>
                 <w:sz w:val="19"/>
               </w:rPr>
-              <w:t>Ngân hàng câu hỏi cộng đồng nhỏ hơn Azota; sản phẩm mới</w:t>
+              <w:t>Ngân hàng câu hỏi cộng đồng nhỏ hơn Azota</w:t>
             </w:r>
           </w:p>
         </w:tc>
         <w:tc>
           <w:tcPr>
-            <w:tcW w:type="dxa" w:w="2608"/>
-            <w:shd w:val="clear" w:fill="F4F6FA"/>
+            <w:tcW w:type="dxa" w:w="2160"/>
           </w:tcPr>
           <w:p>
-            <w:r/>
             <w:r>
               <w:rPr>
+                <w:b w:val="0"/>
                 <w:sz w:val="19"/>
               </w:rPr>
             </w:r>
@@ -1180,13 +1167,12 @@
         </w:tc>
         <w:tc>
           <w:tcPr>
-            <w:tcW w:type="dxa" w:w="2608"/>
-            <w:shd w:val="clear" w:fill="F4F6FA"/>
+            <w:tcW w:type="dxa" w:w="2160"/>
           </w:tcPr>
           <w:p>
-            <w:r/>
             <w:r>
               <w:rPr>
+                <w:b w:val="0"/>
                 <w:sz w:val="19"/>
               </w:rPr>
             </w:r>
@@ -1195,19 +1181,11 @@
       </w:tr>
     </w:tbl>
     <w:p>
-      <w:pPr>
-        <w:spacing w:after="40"/>
-      </w:pPr>
-    </w:p>
-    <w:p>
-      <w:pPr>
-        <w:spacing w:before="280" w:after="120"/>
-      </w:pPr>
       <w:r>
         <w:rPr>
           <w:b/>
           <w:color w:val="0B1B3A"/>
-          <w:sz w:val="24"/>
+          <w:sz w:val="28"/>
         </w:rPr>
         <w:t>2.3 Sổ Chủ Nhiệm Số</w:t>
       </w:r>
@@ -1216,27 +1194,24 @@
       <w:tblPr>
         <w:tblStyle w:val="TableGrid"/>
         <w:tblW w:type="auto" w:w="0"/>
-        <w:jc w:val="center"/>
         <w:tblLook w:firstColumn="1" w:firstRow="1" w:lastColumn="0" w:lastRow="0" w:noHBand="0" w:noVBand="1" w:val="04A0"/>
       </w:tblPr>
       <w:tblGrid>
-        <w:gridCol w:w="2436"/>
-        <w:gridCol w:w="2436"/>
-        <w:gridCol w:w="2436"/>
-        <w:gridCol w:w="2436"/>
+        <w:gridCol w:w="2160"/>
+        <w:gridCol w:w="2160"/>
+        <w:gridCol w:w="2160"/>
+        <w:gridCol w:w="2160"/>
       </w:tblGrid>
       <w:tr>
         <w:tc>
           <w:tcPr>
-            <w:tcW w:type="dxa" w:w="1814"/>
-            <w:shd w:val="clear" w:fill="0B1B3A"/>
+            <w:tcW w:type="dxa" w:w="2160"/>
           </w:tcPr>
           <w:p>
-            <w:r/>
             <w:r>
               <w:rPr>
                 <w:b/>
-                <w:color w:val="FFFFFF"/>
+                <w:color w:val="0B1B3A"/>
                 <w:sz w:val="19"/>
               </w:rPr>
               <w:t>Tiêu chí</w:t>
@@ -1245,15 +1220,13 @@
         </w:tc>
         <w:tc>
           <w:tcPr>
-            <w:tcW w:type="dxa" w:w="2608"/>
-            <w:shd w:val="clear" w:fill="0B1B3A"/>
+            <w:tcW w:type="dxa" w:w="2160"/>
           </w:tcPr>
           <w:p>
-            <w:r/>
             <w:r>
               <w:rPr>
                 <w:b/>
-                <w:color w:val="FFFFFF"/>
+                <w:color w:val="0B1B3A"/>
                 <w:sz w:val="19"/>
               </w:rPr>
               <w:t>Sổ Chủ Nhiệm Số</w:t>
@@ -1262,15 +1235,13 @@
         </w:tc>
         <w:tc>
           <w:tcPr>
-            <w:tcW w:type="dxa" w:w="2608"/>
-            <w:shd w:val="clear" w:fill="0B1B3A"/>
+            <w:tcW w:type="dxa" w:w="2160"/>
           </w:tcPr>
           <w:p>
-            <w:r/>
             <w:r>
               <w:rPr>
                 <w:b/>
-                <w:color w:val="FFFFFF"/>
+                <w:color w:val="0B1B3A"/>
                 <w:sz w:val="19"/>
               </w:rPr>
               <w:t>Hệ MIS lớn (vnEdu, SMAS)</w:t>
@@ -1279,15 +1250,13 @@
         </w:tc>
         <w:tc>
           <w:tcPr>
-            <w:tcW w:type="dxa" w:w="2608"/>
-            <w:shd w:val="clear" w:fill="0B1B3A"/>
+            <w:tcW w:type="dxa" w:w="2160"/>
           </w:tcPr>
           <w:p>
-            <w:r/>
             <w:r>
               <w:rPr>
                 <w:b/>
-                <w:color w:val="FFFFFF"/>
+                <w:color w:val="0B1B3A"/>
                 <w:sz w:val="19"/>
               </w:rPr>
               <w:t>Sổ giấy / Excel</w:t>
@@ -1298,12 +1267,12 @@
       <w:tr>
         <w:tc>
           <w:tcPr>
-            <w:tcW w:type="dxa" w:w="1814"/>
+            <w:tcW w:type="dxa" w:w="2160"/>
           </w:tcPr>
           <w:p>
-            <w:r/>
             <w:r>
               <w:rPr>
+                <w:b w:val="0"/>
                 <w:sz w:val="19"/>
               </w:rPr>
               <w:t>Phạm vi</w:t>
@@ -1312,40 +1281,40 @@
         </w:tc>
         <w:tc>
           <w:tcPr>
-            <w:tcW w:type="dxa" w:w="2608"/>
+            <w:tcW w:type="dxa" w:w="2160"/>
           </w:tcPr>
           <w:p>
-            <w:r/>
             <w:r>
               <w:rPr>
+                <w:b w:val="0"/>
                 <w:sz w:val="19"/>
               </w:rPr>
-              <w:t>Tập trung đúng công tác chủ nhiệm: điểm danh, hạnh kiểm, sổ điểm, báo cáo BGH</w:t>
+              <w:t>Tập trung đúng công tác chủ nhiệm: điểm danh, hạnh kiểm, sổ điểm, thông báo PH</w:t>
             </w:r>
           </w:p>
         </w:tc>
         <w:tc>
           <w:tcPr>
-            <w:tcW w:type="dxa" w:w="2608"/>
+            <w:tcW w:type="dxa" w:w="2160"/>
           </w:tcPr>
           <w:p>
-            <w:r/>
             <w:r>
               <w:rPr>
+                <w:b w:val="0"/>
                 <w:sz w:val="19"/>
               </w:rPr>
-              <w:t>MIS toàn trường: học phí, nhân sự, Tài chính...</w:t>
+              <w:t>MIS toàn trường: học phí, nhân sự, tài chính</w:t>
             </w:r>
           </w:p>
         </w:tc>
         <w:tc>
           <w:tcPr>
-            <w:tcW w:type="dxa" w:w="2608"/>
+            <w:tcW w:type="dxa" w:w="2160"/>
           </w:tcPr>
           <w:p>
-            <w:r/>
             <w:r>
               <w:rPr>
+                <w:b w:val="0"/>
                 <w:sz w:val="19"/>
               </w:rPr>
               <w:t>Thủ công, dễ sai lệch</w:t>
@@ -1356,13 +1325,12 @@
       <w:tr>
         <w:tc>
           <w:tcPr>
-            <w:tcW w:type="dxa" w:w="1814"/>
-            <w:shd w:val="clear" w:fill="F4F6FA"/>
+            <w:tcW w:type="dxa" w:w="2160"/>
           </w:tcPr>
           <w:p>
-            <w:r/>
             <w:r>
               <w:rPr>
+                <w:b w:val="0"/>
                 <w:sz w:val="19"/>
               </w:rPr>
               <w:t>Độ khó triển khai</w:t>
@@ -1371,13 +1339,12 @@
         </w:tc>
         <w:tc>
           <w:tcPr>
-            <w:tcW w:type="dxa" w:w="2608"/>
-            <w:shd w:val="clear" w:fill="F4F6FA"/>
+            <w:tcW w:type="dxa" w:w="2160"/>
           </w:tcPr>
           <w:p>
-            <w:r/>
             <w:r>
               <w:rPr>
+                <w:b w:val="0"/>
                 <w:sz w:val="19"/>
               </w:rPr>
               <w:t>Mở trình duyệt là dùng; demo trong 5 phút</w:t>
@@ -1386,13 +1353,12 @@
         </w:tc>
         <w:tc>
           <w:tcPr>
-            <w:tcW w:type="dxa" w:w="2608"/>
-            <w:shd w:val="clear" w:fill="F4F6FA"/>
+            <w:tcW w:type="dxa" w:w="2160"/>
           </w:tcPr>
           <w:p>
-            <w:r/>
             <w:r>
               <w:rPr>
+                <w:b w:val="0"/>
                 <w:sz w:val="19"/>
               </w:rPr>
               <w:t>Triển khai dài, cần đào tạo</w:t>
@@ -1401,16 +1367,15 @@
         </w:tc>
         <w:tc>
           <w:tcPr>
-            <w:tcW w:type="dxa" w:w="2608"/>
-            <w:shd w:val="clear" w:fill="F4F6FA"/>
+            <w:tcW w:type="dxa" w:w="2160"/>
           </w:tcPr>
           <w:p>
-            <w:r/>
             <w:r>
               <w:rPr>
+                <w:b w:val="0"/>
                 <w:sz w:val="19"/>
               </w:rPr>
-              <w:t>Không cần triển khai nhưng mất thời gian hàng tuần</w:t>
+              <w:t>Không cần triển khai nhưng tốn công hàng ngày</w:t>
             </w:r>
           </w:p>
         </w:tc>
@@ -1418,12 +1383,12 @@
       <w:tr>
         <w:tc>
           <w:tcPr>
-            <w:tcW w:type="dxa" w:w="1814"/>
+            <w:tcW w:type="dxa" w:w="2160"/>
           </w:tcPr>
           <w:p>
-            <w:r/>
             <w:r>
               <w:rPr>
+                <w:b w:val="0"/>
                 <w:sz w:val="19"/>
               </w:rPr>
               <w:t>Chuẩn quy định</w:t>
@@ -1432,12 +1397,12 @@
         </w:tc>
         <w:tc>
           <w:tcPr>
-            <w:tcW w:type="dxa" w:w="2608"/>
+            <w:tcW w:type="dxa" w:w="2160"/>
           </w:tcPr>
           <w:p>
-            <w:r/>
             <w:r>
               <w:rPr>
+                <w:b w:val="0"/>
                 <w:sz w:val="19"/>
               </w:rPr>
               <w:t>Điều lệ trường mới nhất (TT 15/2026/TT-BGDĐT)</w:t>
@@ -1446,12 +1411,12 @@
         </w:tc>
         <w:tc>
           <w:tcPr>
-            <w:tcW w:type="dxa" w:w="2608"/>
+            <w:tcW w:type="dxa" w:w="2160"/>
           </w:tcPr>
           <w:p>
-            <w:r/>
             <w:r>
               <w:rPr>
+                <w:b w:val="0"/>
                 <w:sz w:val="19"/>
               </w:rPr>
               <w:t>Đa số cập nhật chậm</w:t>
@@ -1460,12 +1425,12 @@
         </w:tc>
         <w:tc>
           <w:tcPr>
-            <w:tcW w:type="dxa" w:w="2608"/>
+            <w:tcW w:type="dxa" w:w="2160"/>
           </w:tcPr>
           <w:p>
-            <w:r/>
             <w:r>
               <w:rPr>
+                <w:b w:val="0"/>
                 <w:sz w:val="19"/>
               </w:rPr>
               <w:t>Không có</w:t>
@@ -1476,13 +1441,12 @@
       <w:tr>
         <w:tc>
           <w:tcPr>
-            <w:tcW w:type="dxa" w:w="1814"/>
-            <w:shd w:val="clear" w:fill="F4F6FA"/>
+            <w:tcW w:type="dxa" w:w="2160"/>
           </w:tcPr>
           <w:p>
-            <w:r/>
             <w:r>
               <w:rPr>
+                <w:b w:val="0"/>
                 <w:sz w:val="19"/>
               </w:rPr>
               <w:t>Chi phí</w:t>
@@ -1491,13 +1455,12 @@
         </w:tc>
         <w:tc>
           <w:tcPr>
-            <w:tcW w:type="dxa" w:w="2608"/>
-            <w:shd w:val="clear" w:fill="F4F6FA"/>
+            <w:tcW w:type="dxa" w:w="2160"/>
           </w:tcPr>
           <w:p>
-            <w:r/>
             <w:r>
               <w:rPr>
+                <w:b w:val="0"/>
                 <w:sz w:val="19"/>
               </w:rPr>
               <w:t>Tính theo học sinh, phù hợp trường vừa và nhỏ</w:t>
@@ -1506,13 +1469,12 @@
         </w:tc>
         <w:tc>
           <w:tcPr>
-            <w:tcW w:type="dxa" w:w="2608"/>
-            <w:shd w:val="clear" w:fill="F4F6FA"/>
+            <w:tcW w:type="dxa" w:w="2160"/>
           </w:tcPr>
           <w:p>
-            <w:r/>
             <w:r>
               <w:rPr>
+                <w:b w:val="0"/>
                 <w:sz w:val="19"/>
               </w:rPr>
               <w:t>Đắt, gói lớn bắt buộc</w:t>
@@ -1521,13 +1483,12 @@
         </w:tc>
         <w:tc>
           <w:tcPr>
-            <w:tcW w:type="dxa" w:w="2608"/>
-            <w:shd w:val="clear" w:fill="F4F6FA"/>
+            <w:tcW w:type="dxa" w:w="2160"/>
           </w:tcPr>
           <w:p>
-            <w:r/>
             <w:r>
               <w:rPr>
+                <w:b w:val="0"/>
                 <w:sz w:val="19"/>
               </w:rPr>
               <w:t>Miễn phí nhưng tốn công</w:t>
@@ -1538,12 +1499,12 @@
       <w:tr>
         <w:tc>
           <w:tcPr>
-            <w:tcW w:type="dxa" w:w="1814"/>
+            <w:tcW w:type="dxa" w:w="2160"/>
           </w:tcPr>
           <w:p>
-            <w:r/>
             <w:r>
               <w:rPr>
+                <w:b w:val="0"/>
                 <w:sz w:val="19"/>
               </w:rPr>
               <w:t>Điểm yếu của chúng tôi</w:t>
@@ -1552,12 +1513,12 @@
         </w:tc>
         <w:tc>
           <w:tcPr>
-            <w:tcW w:type="dxa" w:w="2608"/>
+            <w:tcW w:type="dxa" w:w="2160"/>
           </w:tcPr>
           <w:p>
-            <w:r/>
             <w:r>
               <w:rPr>
+                <w:b w:val="0"/>
                 <w:sz w:val="19"/>
               </w:rPr>
               <w:t>Không thay thế MIS toàn trường (chưa có học phí, nhân sự)</w:t>
@@ -1566,12 +1527,12 @@
         </w:tc>
         <w:tc>
           <w:tcPr>
-            <w:tcW w:type="dxa" w:w="2608"/>
+            <w:tcW w:type="dxa" w:w="2160"/>
           </w:tcPr>
           <w:p>
-            <w:r/>
             <w:r>
               <w:rPr>
+                <w:b w:val="0"/>
                 <w:sz w:val="19"/>
               </w:rPr>
             </w:r>
@@ -1579,12 +1540,12 @@
         </w:tc>
         <w:tc>
           <w:tcPr>
-            <w:tcW w:type="dxa" w:w="2608"/>
+            <w:tcW w:type="dxa" w:w="2160"/>
           </w:tcPr>
           <w:p>
-            <w:r/>
             <w:r>
               <w:rPr>
+                <w:b w:val="0"/>
                 <w:sz w:val="19"/>
               </w:rPr>
             </w:r>
@@ -1593,51 +1554,29 @@
       </w:tr>
     </w:tbl>
     <w:p>
-      <w:pPr>
-        <w:spacing w:after="40"/>
-      </w:pPr>
+      <w:r>
+        <w:rPr>
+          <w:b/>
+          <w:color w:val="0B1B3A"/>
+          <w:sz w:val="36"/>
+        </w:rPr>
+        <w:t>3. Hướng dẫn sử dụng và tài khoản trải nghiệm</w:t>
+      </w:r>
     </w:p>
     <w:p>
       <w:r>
-        <w:br w:type="page"/>
+        <w:rPr>
+          <w:sz w:val="22"/>
+        </w:rPr>
+        <w:t>Mỗi sản phẩm có tài khoản demo riêng theo vai trò - đăng nhập như người dùng thật, dữ liệu là dữ liệu thật trong môi trường demo.</w:t>
       </w:r>
     </w:p>
     <w:p>
-      <w:pPr>
-        <w:spacing w:before="280" w:after="120"/>
-      </w:pPr>
       <w:r>
         <w:rPr>
           <w:b/>
           <w:color w:val="0B1B3A"/>
           <w:sz w:val="28"/>
-        </w:rPr>
-        <w:t>3. Hướng dẫn sử dụng và tài khoản trải nghiệm</w:t>
-      </w:r>
-    </w:p>
-    <w:p>
-      <w:pPr>
-        <w:spacing w:after="120"/>
-      </w:pPr>
-      <w:r>
-        <w:rPr>
-          <w:b w:val="0"/>
-          <w:i w:val="0"/>
-          <w:color w:val="556070"/>
-          <w:sz w:val="21"/>
-        </w:rPr>
-        <w:t>Mỗi sản phẩm có tài khoản demo riêng theo vai trò - đăng nhập như người dùng thật, dữ liệu là dữ liệu mẫu an toàn để thử nghiệm đầy đủ.</w:t>
-      </w:r>
-    </w:p>
-    <w:p>
-      <w:pPr>
-        <w:spacing w:before="280" w:after="120"/>
-      </w:pPr>
-      <w:r>
-        <w:rPr>
-          <w:b/>
-          <w:color w:val="0B1B3A"/>
-          <w:sz w:val="24"/>
         </w:rPr>
         <w:t>3.1 English Arena - ea.vieschool.com</w:t>
       </w:r>
@@ -1645,7 +1584,6 @@
     <w:p>
       <w:pPr>
         <w:pStyle w:val="ListBullet"/>
-        <w:spacing w:after="60"/>
       </w:pPr>
       <w:r>
         <w:t>Mở ea.vieschool.com từ trình duyệt bất kỳ - không cần cài đặt.</w:t>
@@ -1654,55 +1592,57 @@
     <w:p>
       <w:pPr>
         <w:pStyle w:val="ListBullet"/>
-        <w:spacing w:after="60"/>
       </w:pPr>
       <w:r>
-        <w:t>Khách chưa có tài khoản: nhấn "Chơi thử" - mỗi lớp được 1 vòng miễn phí; từ vòng 2 hệ thống mời đăng nhập.</w:t>
+        <w:t>Khách chưa có tài khoản: nhấn "Chơi không cần tài khoản" - 1 vòng miễn phí mỗi lớp.</w:t>
       </w:r>
     </w:p>
     <w:p>
       <w:pPr>
         <w:pStyle w:val="ListBullet"/>
-        <w:spacing w:after="60"/>
       </w:pPr>
       <w:r>
-        <w:t>Học sinh: đăng nhập bằng username + PIN do giáo viên/nhà trường cấp - chọn vùng đất (khối lớp) - chơi đủ 4 vòng - nhận sao và huy hiệu.</w:t>
+        <w:t>Học sinh: đăng nhập bằng username + PIN do giáo viên/nhà trường cấp - chọn khối lớp - chọn môn (Tiếng Anh / Toán / Khoa học) - Luyện đề có đồng hồ đo giờ, Thi thử đếm ngược theo từng khối.</w:t>
       </w:r>
     </w:p>
     <w:p>
       <w:pPr>
         <w:pStyle w:val="ListBullet"/>
-        <w:spacing w:after="60"/>
       </w:pPr>
       <w:r>
-        <w:t>Quản trị: đăng nhập tài khoản admin - tạo tài khoản học sinh, gán phạm vi lớp, xem tiến độ.</w:t>
+        <w:t>Vào lớp: nhập mã lớp 6 ký tự cô gửi (VD lớp demo: R8WHYF) - không cần admin gán tay.</w:t>
+      </w:r>
+    </w:p>
+    <w:p>
+      <w:pPr>
+        <w:pStyle w:val="ListBullet"/>
+      </w:pPr>
+      <w:r>
+        <w:t>Quản trị: tạo tài khoản học sinh, tạo lớp sinh mã tự động, gán phạm vi lớp, xem tiến độ.</w:t>
       </w:r>
     </w:p>
     <w:tbl>
       <w:tblPr>
         <w:tblStyle w:val="TableGrid"/>
         <w:tblW w:type="auto" w:w="0"/>
-        <w:jc w:val="center"/>
         <w:tblLook w:firstColumn="1" w:firstRow="1" w:lastColumn="0" w:lastRow="0" w:noHBand="0" w:noVBand="1" w:val="04A0"/>
       </w:tblPr>
       <w:tblGrid>
-        <w:gridCol w:w="2436"/>
-        <w:gridCol w:w="2436"/>
-        <w:gridCol w:w="2436"/>
-        <w:gridCol w:w="2436"/>
+        <w:gridCol w:w="2160"/>
+        <w:gridCol w:w="2160"/>
+        <w:gridCol w:w="2160"/>
+        <w:gridCol w:w="2160"/>
       </w:tblGrid>
       <w:tr>
         <w:tc>
           <w:tcPr>
-            <w:tcW w:type="dxa" w:w="2551"/>
-            <w:shd w:val="clear" w:fill="0B1B3A"/>
+            <w:tcW w:type="dxa" w:w="2160"/>
           </w:tcPr>
           <w:p>
-            <w:r/>
             <w:r>
               <w:rPr>
                 <w:b/>
-                <w:color w:val="FFFFFF"/>
+                <w:color w:val="0B1B3A"/>
                 <w:sz w:val="19"/>
               </w:rPr>
               <w:t>Vai trò</w:t>
@@ -1711,15 +1651,13 @@
         </w:tc>
         <w:tc>
           <w:tcPr>
-            <w:tcW w:type="dxa" w:w="1984"/>
-            <w:shd w:val="clear" w:fill="0B1B3A"/>
+            <w:tcW w:type="dxa" w:w="2160"/>
           </w:tcPr>
           <w:p>
-            <w:r/>
             <w:r>
               <w:rPr>
                 <w:b/>
-                <w:color w:val="FFFFFF"/>
+                <w:color w:val="0B1B3A"/>
                 <w:sz w:val="19"/>
               </w:rPr>
               <w:t>Username</w:t>
@@ -1728,15 +1666,13 @@
         </w:tc>
         <w:tc>
           <w:tcPr>
-            <w:tcW w:type="dxa" w:w="1587"/>
-            <w:shd w:val="clear" w:fill="0B1B3A"/>
+            <w:tcW w:type="dxa" w:w="2160"/>
           </w:tcPr>
           <w:p>
-            <w:r/>
             <w:r>
               <w:rPr>
                 <w:b/>
-                <w:color w:val="FFFFFF"/>
+                <w:color w:val="0B1B3A"/>
                 <w:sz w:val="19"/>
               </w:rPr>
               <w:t>PIN</w:t>
@@ -1745,15 +1681,13 @@
         </w:tc>
         <w:tc>
           <w:tcPr>
-            <w:tcW w:type="dxa" w:w="3402"/>
-            <w:shd w:val="clear" w:fill="0B1B3A"/>
+            <w:tcW w:type="dxa" w:w="2160"/>
           </w:tcPr>
           <w:p>
-            <w:r/>
             <w:r>
               <w:rPr>
                 <w:b/>
-                <w:color w:val="FFFFFF"/>
+                <w:color w:val="0B1B3A"/>
                 <w:sz w:val="19"/>
               </w:rPr>
               <w:t>Phạm vi</w:t>
@@ -1764,12 +1698,12 @@
       <w:tr>
         <w:tc>
           <w:tcPr>
-            <w:tcW w:type="dxa" w:w="2551"/>
+            <w:tcW w:type="dxa" w:w="2160"/>
           </w:tcPr>
           <w:p>
-            <w:r/>
             <w:r>
               <w:rPr>
+                <w:b w:val="0"/>
                 <w:sz w:val="19"/>
               </w:rPr>
               <w:t>Quản trị viên</w:t>
@@ -1778,12 +1712,12 @@
         </w:tc>
         <w:tc>
           <w:tcPr>
-            <w:tcW w:type="dxa" w:w="1984"/>
+            <w:tcW w:type="dxa" w:w="2160"/>
           </w:tcPr>
           <w:p>
-            <w:r/>
             <w:r>
               <w:rPr>
+                <w:b w:val="0"/>
                 <w:sz w:val="19"/>
               </w:rPr>
               <w:t>demo_admin</w:t>
@@ -1792,12 +1726,12 @@
         </w:tc>
         <w:tc>
           <w:tcPr>
-            <w:tcW w:type="dxa" w:w="1587"/>
+            <w:tcW w:type="dxa" w:w="2160"/>
           </w:tcPr>
           <w:p>
-            <w:r/>
             <w:r>
               <w:rPr>
+                <w:b w:val="0"/>
                 <w:sz w:val="19"/>
               </w:rPr>
               <w:t>demo2026</w:t>
@@ -1806,12 +1740,12 @@
         </w:tc>
         <w:tc>
           <w:tcPr>
-            <w:tcW w:type="dxa" w:w="3402"/>
+            <w:tcW w:type="dxa" w:w="2160"/>
           </w:tcPr>
           <w:p>
-            <w:r/>
             <w:r>
               <w:rPr>
+                <w:b w:val="0"/>
                 <w:sz w:val="19"/>
               </w:rPr>
               <w:t>Console quản trị: tạo tài khoản, gán lớp, báo cáo</w:t>
@@ -1822,13 +1756,12 @@
       <w:tr>
         <w:tc>
           <w:tcPr>
-            <w:tcW w:type="dxa" w:w="2551"/>
-            <w:shd w:val="clear" w:fill="F4F6FA"/>
+            <w:tcW w:type="dxa" w:w="2160"/>
           </w:tcPr>
           <w:p>
-            <w:r/>
             <w:r>
               <w:rPr>
+                <w:b w:val="0"/>
                 <w:sz w:val="19"/>
               </w:rPr>
               <w:t>Học sinh</w:t>
@@ -1837,13 +1770,12 @@
         </w:tc>
         <w:tc>
           <w:tcPr>
-            <w:tcW w:type="dxa" w:w="1984"/>
-            <w:shd w:val="clear" w:fill="F4F6FA"/>
+            <w:tcW w:type="dxa" w:w="2160"/>
           </w:tcPr>
           <w:p>
-            <w:r/>
             <w:r>
               <w:rPr>
+                <w:b w:val="0"/>
                 <w:sz w:val="19"/>
               </w:rPr>
               <w:t>demo_hs</w:t>
@@ -1852,13 +1784,12 @@
         </w:tc>
         <w:tc>
           <w:tcPr>
-            <w:tcW w:type="dxa" w:w="1587"/>
-            <w:shd w:val="clear" w:fill="F4F6FA"/>
+            <w:tcW w:type="dxa" w:w="2160"/>
           </w:tcPr>
           <w:p>
-            <w:r/>
             <w:r>
               <w:rPr>
+                <w:b w:val="0"/>
                 <w:sz w:val="19"/>
               </w:rPr>
               <w:t>demo2026</w:t>
@@ -1867,16 +1798,15 @@
         </w:tc>
         <w:tc>
           <w:tcPr>
-            <w:tcW w:type="dxa" w:w="3402"/>
-            <w:shd w:val="clear" w:fill="F4F6FA"/>
+            <w:tcW w:type="dxa" w:w="2160"/>
           </w:tcPr>
           <w:p>
-            <w:r/>
             <w:r>
               <w:rPr>
+                <w:b w:val="0"/>
                 <w:sz w:val="19"/>
               </w:rPr>
-              <w:t>Đủ 5 khối lớp 1-5, đủ 4 vòng, lưu tiến độ</w:t>
+              <w:t>Đủ 5 khối lớp 1-5, lưu tiến độ</w:t>
             </w:r>
           </w:p>
         </w:tc>
@@ -1884,12 +1814,12 @@
       <w:tr>
         <w:tc>
           <w:tcPr>
-            <w:tcW w:type="dxa" w:w="2551"/>
+            <w:tcW w:type="dxa" w:w="2160"/>
           </w:tcPr>
           <w:p>
-            <w:r/>
             <w:r>
               <w:rPr>
+                <w:b w:val="0"/>
                 <w:sz w:val="19"/>
               </w:rPr>
               <w:t>Khách (không cần tài khoản)</w:t>
@@ -1898,12 +1828,12 @@
         </w:tc>
         <w:tc>
           <w:tcPr>
-            <w:tcW w:type="dxa" w:w="1984"/>
+            <w:tcW w:type="dxa" w:w="2160"/>
           </w:tcPr>
           <w:p>
-            <w:r/>
             <w:r>
               <w:rPr>
+                <w:b w:val="0"/>
                 <w:sz w:val="19"/>
               </w:rPr>
               <w:t>-</w:t>
@@ -1912,12 +1842,12 @@
         </w:tc>
         <w:tc>
           <w:tcPr>
-            <w:tcW w:type="dxa" w:w="1587"/>
+            <w:tcW w:type="dxa" w:w="2160"/>
           </w:tcPr>
           <w:p>
-            <w:r/>
             <w:r>
               <w:rPr>
+                <w:b w:val="0"/>
                 <w:sz w:val="19"/>
               </w:rPr>
               <w:t>-</w:t>
@@ -1926,12 +1856,12 @@
         </w:tc>
         <w:tc>
           <w:tcPr>
-            <w:tcW w:type="dxa" w:w="3402"/>
+            <w:tcW w:type="dxa" w:w="2160"/>
           </w:tcPr>
           <w:p>
-            <w:r/>
             <w:r>
               <w:rPr>
+                <w:b w:val="0"/>
                 <w:sz w:val="19"/>
               </w:rPr>
               <w:t>1 vòng miễn phí mỗi lớp</w:t>
@@ -1941,19 +1871,11 @@
       </w:tr>
     </w:tbl>
     <w:p>
-      <w:pPr>
-        <w:spacing w:after="40"/>
-      </w:pPr>
-    </w:p>
-    <w:p>
-      <w:pPr>
-        <w:spacing w:before="280" w:after="120"/>
-      </w:pPr>
       <w:r>
         <w:rPr>
           <w:b/>
           <w:color w:val="0B1B3A"/>
-          <w:sz w:val="24"/>
+          <w:sz w:val="28"/>
         </w:rPr>
         <w:t>3.2 Công cụ số Giáo viên - congcuso.vieschool.com</w:t>
       </w:r>
@@ -1961,25 +1883,22 @@
     <w:p>
       <w:pPr>
         <w:pStyle w:val="ListBullet"/>
-        <w:spacing w:after="60"/>
       </w:pPr>
       <w:r>
-        <w:t>Đăng nhập bằng email + mật khẩu.</w:t>
+        <w:t>Đăng nhập bằng email + mật khẩu; đổi mật khẩu ngay trong tài khoản.</w:t>
       </w:r>
     </w:p>
     <w:p>
       <w:pPr>
         <w:pStyle w:val="ListBullet"/>
-        <w:spacing w:after="60"/>
       </w:pPr>
       <w:r>
-        <w:t>Giáo viên: chọn công cụ (ngân hàng câu hỏi, ma trận, đề thi...) - nhập yêu cầu - tạo nội dung - xuất DOCX/PDF.</w:t>
+        <w:t>Giáo viên: chọn công cụ (ngân hàng câu hỏi, ma trận, đề thi...) - nhập yêu cầu - tạo nội dung.</w:t>
       </w:r>
     </w:p>
     <w:p>
       <w:pPr>
         <w:pStyle w:val="ListBullet"/>
-        <w:spacing w:after="60"/>
       </w:pPr>
       <w:r>
         <w:t>Kiểm định: duyệt nội dung trước khi công khai trong thư viện chung.</w:t>
@@ -1989,26 +1908,23 @@
       <w:tblPr>
         <w:tblStyle w:val="TableGrid"/>
         <w:tblW w:type="auto" w:w="0"/>
-        <w:jc w:val="center"/>
         <w:tblLook w:firstColumn="1" w:firstRow="1" w:lastColumn="0" w:lastRow="0" w:noHBand="0" w:noVBand="1" w:val="04A0"/>
       </w:tblPr>
       <w:tblGrid>
-        <w:gridCol w:w="3249"/>
-        <w:gridCol w:w="3249"/>
-        <w:gridCol w:w="3249"/>
+        <w:gridCol w:w="2880"/>
+        <w:gridCol w:w="2880"/>
+        <w:gridCol w:w="2880"/>
       </w:tblGrid>
       <w:tr>
         <w:tc>
           <w:tcPr>
-            <w:tcW w:type="dxa" w:w="2835"/>
-            <w:shd w:val="clear" w:fill="0B1B3A"/>
+            <w:tcW w:type="dxa" w:w="2880"/>
           </w:tcPr>
           <w:p>
-            <w:r/>
             <w:r>
               <w:rPr>
                 <w:b/>
-                <w:color w:val="FFFFFF"/>
+                <w:color w:val="0B1B3A"/>
                 <w:sz w:val="19"/>
               </w:rPr>
               <w:t>Vai trò</w:t>
@@ -2017,15 +1933,13 @@
         </w:tc>
         <w:tc>
           <w:tcPr>
-            <w:tcW w:type="dxa" w:w="3402"/>
-            <w:shd w:val="clear" w:fill="0B1B3A"/>
+            <w:tcW w:type="dxa" w:w="2880"/>
           </w:tcPr>
           <w:p>
-            <w:r/>
             <w:r>
               <w:rPr>
                 <w:b/>
-                <w:color w:val="FFFFFF"/>
+                <w:color w:val="0B1B3A"/>
                 <w:sz w:val="19"/>
               </w:rPr>
               <w:t>Email</w:t>
@@ -2034,15 +1948,13 @@
         </w:tc>
         <w:tc>
           <w:tcPr>
-            <w:tcW w:type="dxa" w:w="2268"/>
-            <w:shd w:val="clear" w:fill="0B1B3A"/>
+            <w:tcW w:type="dxa" w:w="2880"/>
           </w:tcPr>
           <w:p>
-            <w:r/>
             <w:r>
               <w:rPr>
                 <w:b/>
-                <w:color w:val="FFFFFF"/>
+                <w:color w:val="0B1B3A"/>
                 <w:sz w:val="19"/>
               </w:rPr>
               <w:t>Mật khẩu</w:t>
@@ -2053,12 +1965,12 @@
       <w:tr>
         <w:tc>
           <w:tcPr>
-            <w:tcW w:type="dxa" w:w="2835"/>
+            <w:tcW w:type="dxa" w:w="2880"/>
           </w:tcPr>
           <w:p>
-            <w:r/>
             <w:r>
               <w:rPr>
+                <w:b w:val="0"/>
                 <w:sz w:val="19"/>
               </w:rPr>
               <w:t>Quản trị viên</w:t>
@@ -2067,12 +1979,12 @@
         </w:tc>
         <w:tc>
           <w:tcPr>
-            <w:tcW w:type="dxa" w:w="3402"/>
+            <w:tcW w:type="dxa" w:w="2880"/>
           </w:tcPr>
           <w:p>
-            <w:r/>
             <w:r>
               <w:rPr>
+                <w:b w:val="0"/>
                 <w:sz w:val="19"/>
               </w:rPr>
               <w:t>admin@demo.tvc</w:t>
@@ -2081,12 +1993,12 @@
         </w:tc>
         <w:tc>
           <w:tcPr>
-            <w:tcW w:type="dxa" w:w="2268"/>
+            <w:tcW w:type="dxa" w:w="2880"/>
           </w:tcPr>
           <w:p>
-            <w:r/>
             <w:r>
               <w:rPr>
+                <w:b w:val="0"/>
                 <w:sz w:val="19"/>
               </w:rPr>
               <w:t>demo1234</w:t>
@@ -2097,13 +2009,12 @@
       <w:tr>
         <w:tc>
           <w:tcPr>
-            <w:tcW w:type="dxa" w:w="2835"/>
-            <w:shd w:val="clear" w:fill="F4F6FA"/>
+            <w:tcW w:type="dxa" w:w="2880"/>
           </w:tcPr>
           <w:p>
-            <w:r/>
             <w:r>
               <w:rPr>
+                <w:b w:val="0"/>
                 <w:sz w:val="19"/>
               </w:rPr>
               <w:t>Giáo viên</w:t>
@@ -2112,13 +2023,12 @@
         </w:tc>
         <w:tc>
           <w:tcPr>
-            <w:tcW w:type="dxa" w:w="3402"/>
-            <w:shd w:val="clear" w:fill="F4F6FA"/>
+            <w:tcW w:type="dxa" w:w="2880"/>
           </w:tcPr>
           <w:p>
-            <w:r/>
             <w:r>
               <w:rPr>
+                <w:b w:val="0"/>
                 <w:sz w:val="19"/>
               </w:rPr>
               <w:t>gv@demo.tvc</w:t>
@@ -2127,13 +2037,12 @@
         </w:tc>
         <w:tc>
           <w:tcPr>
-            <w:tcW w:type="dxa" w:w="2268"/>
-            <w:shd w:val="clear" w:fill="F4F6FA"/>
+            <w:tcW w:type="dxa" w:w="2880"/>
           </w:tcPr>
           <w:p>
-            <w:r/>
             <w:r>
               <w:rPr>
+                <w:b w:val="0"/>
                 <w:sz w:val="19"/>
               </w:rPr>
               <w:t>demo1234</w:t>
@@ -2144,12 +2053,12 @@
       <w:tr>
         <w:tc>
           <w:tcPr>
-            <w:tcW w:type="dxa" w:w="2835"/>
+            <w:tcW w:type="dxa" w:w="2880"/>
           </w:tcPr>
           <w:p>
-            <w:r/>
             <w:r>
               <w:rPr>
+                <w:b w:val="0"/>
                 <w:sz w:val="19"/>
               </w:rPr>
               <w:t>Kiểm định viên</w:t>
@@ -2158,12 +2067,12 @@
         </w:tc>
         <w:tc>
           <w:tcPr>
-            <w:tcW w:type="dxa" w:w="3402"/>
+            <w:tcW w:type="dxa" w:w="2880"/>
           </w:tcPr>
           <w:p>
-            <w:r/>
             <w:r>
               <w:rPr>
+                <w:b w:val="0"/>
                 <w:sz w:val="19"/>
               </w:rPr>
               <w:t>kd@demo.tvc</w:t>
@@ -2172,12 +2081,12 @@
         </w:tc>
         <w:tc>
           <w:tcPr>
-            <w:tcW w:type="dxa" w:w="2268"/>
+            <w:tcW w:type="dxa" w:w="2880"/>
           </w:tcPr>
           <w:p>
-            <w:r/>
             <w:r>
               <w:rPr>
+                <w:b w:val="0"/>
                 <w:sz w:val="19"/>
               </w:rPr>
               <w:t>demo1234</w:t>
@@ -2187,83 +2096,45 @@
       </w:tr>
     </w:tbl>
     <w:p>
-      <w:pPr>
-        <w:spacing w:after="40"/>
-      </w:pPr>
-    </w:p>
-    <w:p>
-      <w:pPr>
-        <w:spacing w:before="280" w:after="120"/>
-      </w:pPr>
       <w:r>
         <w:rPr>
           <w:b/>
           <w:color w:val="0B1B3A"/>
-          <w:sz w:val="24"/>
+          <w:sz w:val="28"/>
         </w:rPr>
         <w:t>3.3 Sổ Chủ Nhiệm Số - sochunhiem.vieschool.com</w:t>
       </w:r>
     </w:p>
     <w:p>
-      <w:pPr>
-        <w:pStyle w:val="ListBullet"/>
-        <w:spacing w:after="60"/>
-      </w:pPr>
       <w:r>
-        <w:t>Đăng nhập bằng email + mật khẩu - hệ thống tự đưa về đúng màn hình theo vai trò.</w:t>
-      </w:r>
-    </w:p>
-    <w:p>
-      <w:pPr>
-        <w:pStyle w:val="ListBullet"/>
-        <w:spacing w:after="60"/>
-      </w:pPr>
-      <w:r>
-        <w:t>GVCN: điểm danh hàng ngày, nhập hạnh kiểm, sổ điểm, thông báo phụ huynh.</w:t>
-      </w:r>
-    </w:p>
-    <w:p>
-      <w:pPr>
-        <w:pStyle w:val="ListBullet"/>
-        <w:spacing w:after="60"/>
-      </w:pPr>
-      <w:r>
-        <w:t>Ban giám hiệu: dashboard toàn trường, báo cáo tổng hợp, không cần chờ sổ giấy.</w:t>
-      </w:r>
-    </w:p>
-    <w:p>
-      <w:pPr>
-        <w:pStyle w:val="ListBullet"/>
-        <w:spacing w:after="60"/>
-      </w:pPr>
-      <w:r>
-        <w:t>Phụ huynh/học sinh: xem điểm danh, điểm số, nhận xét của con em mình.</w:t>
+        <w:rPr>
+          <w:sz w:val="22"/>
+        </w:rPr>
+        <w:t>Đăng nhập email + mật khẩu - hệ thống tự đưa về đúng màn hình theo vai trò. Mật khẩu chung tài khoản demo: demo1234.</w:t>
       </w:r>
     </w:p>
     <w:tbl>
       <w:tblPr>
         <w:tblStyle w:val="TableGrid"/>
         <w:tblW w:type="auto" w:w="0"/>
-        <w:jc w:val="center"/>
         <w:tblLook w:firstColumn="1" w:firstRow="1" w:lastColumn="0" w:lastRow="0" w:noHBand="0" w:noVBand="1" w:val="04A0"/>
       </w:tblPr>
       <w:tblGrid>
-        <w:gridCol w:w="3249"/>
-        <w:gridCol w:w="3249"/>
-        <w:gridCol w:w="3249"/>
+        <w:gridCol w:w="2160"/>
+        <w:gridCol w:w="2160"/>
+        <w:gridCol w:w="2160"/>
+        <w:gridCol w:w="2160"/>
       </w:tblGrid>
       <w:tr>
         <w:tc>
           <w:tcPr>
-            <w:tcW w:type="dxa" w:w="2835"/>
-            <w:shd w:val="clear" w:fill="0B1B3A"/>
+            <w:tcW w:type="dxa" w:w="2160"/>
           </w:tcPr>
           <w:p>
-            <w:r/>
             <w:r>
               <w:rPr>
                 <w:b/>
-                <w:color w:val="FFFFFF"/>
+                <w:color w:val="0B1B3A"/>
                 <w:sz w:val="19"/>
               </w:rPr>
               <w:t>Vai trò</w:t>
@@ -2272,15 +2143,13 @@
         </w:tc>
         <w:tc>
           <w:tcPr>
-            <w:tcW w:type="dxa" w:w="3402"/>
-            <w:shd w:val="clear" w:fill="0B1B3A"/>
+            <w:tcW w:type="dxa" w:w="2160"/>
           </w:tcPr>
           <w:p>
-            <w:r/>
             <w:r>
               <w:rPr>
                 <w:b/>
-                <w:color w:val="FFFFFF"/>
+                <w:color w:val="0B1B3A"/>
                 <w:sz w:val="19"/>
               </w:rPr>
               <w:t>Email</w:t>
@@ -2289,18 +2158,31 @@
         </w:tc>
         <w:tc>
           <w:tcPr>
-            <w:tcW w:type="dxa" w:w="2268"/>
-            <w:shd w:val="clear" w:fill="0B1B3A"/>
+            <w:tcW w:type="dxa" w:w="2160"/>
           </w:tcPr>
           <w:p>
-            <w:r/>
             <w:r>
               <w:rPr>
                 <w:b/>
-                <w:color w:val="FFFFFF"/>
+                <w:color w:val="0B1B3A"/>
                 <w:sz w:val="19"/>
               </w:rPr>
-              <w:t>Mật khẩu</w:t>
+              <w:t>Vai trò</w:t>
+            </w:r>
+          </w:p>
+        </w:tc>
+        <w:tc>
+          <w:tcPr>
+            <w:tcW w:type="dxa" w:w="2160"/>
+          </w:tcPr>
+          <w:p>
+            <w:r>
+              <w:rPr>
+                <w:b/>
+                <w:color w:val="0B1B3A"/>
+                <w:sz w:val="19"/>
+              </w:rPr>
+              <w:t>Email</w:t>
             </w:r>
           </w:p>
         </w:tc>
@@ -2308,12 +2190,12 @@
       <w:tr>
         <w:tc>
           <w:tcPr>
-            <w:tcW w:type="dxa" w:w="2835"/>
+            <w:tcW w:type="dxa" w:w="2160"/>
           </w:tcPr>
           <w:p>
-            <w:r/>
             <w:r>
               <w:rPr>
+                <w:b w:val="0"/>
                 <w:sz w:val="19"/>
               </w:rPr>
               <w:t>Ban giám hiệu</w:t>
@@ -2322,12 +2204,12 @@
         </w:tc>
         <w:tc>
           <w:tcPr>
-            <w:tcW w:type="dxa" w:w="3402"/>
+            <w:tcW w:type="dxa" w:w="2160"/>
           </w:tcPr>
           <w:p>
-            <w:r/>
             <w:r>
               <w:rPr>
+                <w:b w:val="0"/>
                 <w:sz w:val="19"/>
               </w:rPr>
               <w:t>bgh@demo.scn</w:t>
@@ -2336,15 +2218,29 @@
         </w:tc>
         <w:tc>
           <w:tcPr>
-            <w:tcW w:type="dxa" w:w="2268"/>
+            <w:tcW w:type="dxa" w:w="2160"/>
           </w:tcPr>
           <w:p>
-            <w:r/>
             <w:r>
               <w:rPr>
+                <w:b w:val="0"/>
                 <w:sz w:val="19"/>
               </w:rPr>
-              <w:t>demo1234</w:t>
+              <w:t>Tổ trưởng CM</w:t>
+            </w:r>
+          </w:p>
+        </w:tc>
+        <w:tc>
+          <w:tcPr>
+            <w:tcW w:type="dxa" w:w="2160"/>
+          </w:tcPr>
+          <w:p>
+            <w:r>
+              <w:rPr>
+                <w:b w:val="0"/>
+                <w:sz w:val="19"/>
+              </w:rPr>
+              <w:t>totruong@demo.scn</w:t>
             </w:r>
           </w:p>
         </w:tc>
@@ -2352,13 +2248,12 @@
       <w:tr>
         <w:tc>
           <w:tcPr>
-            <w:tcW w:type="dxa" w:w="2835"/>
-            <w:shd w:val="clear" w:fill="F4F6FA"/>
+            <w:tcW w:type="dxa" w:w="2160"/>
           </w:tcPr>
           <w:p>
-            <w:r/>
             <w:r>
               <w:rPr>
+                <w:b w:val="0"/>
                 <w:sz w:val="19"/>
               </w:rPr>
               <w:t>Phó hiệu trưởng</w:t>
@@ -2367,13 +2262,12 @@
         </w:tc>
         <w:tc>
           <w:tcPr>
-            <w:tcW w:type="dxa" w:w="3402"/>
-            <w:shd w:val="clear" w:fill="F4F6FA"/>
+            <w:tcW w:type="dxa" w:w="2160"/>
           </w:tcPr>
           <w:p>
-            <w:r/>
             <w:r>
               <w:rPr>
+                <w:b w:val="0"/>
                 <w:sz w:val="19"/>
               </w:rPr>
               <w:t>pht@demo.scn</w:t>
@@ -2382,16 +2276,29 @@
         </w:tc>
         <w:tc>
           <w:tcPr>
-            <w:tcW w:type="dxa" w:w="2268"/>
-            <w:shd w:val="clear" w:fill="F4F6FA"/>
+            <w:tcW w:type="dxa" w:w="2160"/>
           </w:tcPr>
           <w:p>
-            <w:r/>
             <w:r>
               <w:rPr>
+                <w:b w:val="0"/>
                 <w:sz w:val="19"/>
               </w:rPr>
-              <w:t>demo1234</w:t>
+              <w:t>Kế toán</w:t>
+            </w:r>
+          </w:p>
+        </w:tc>
+        <w:tc>
+          <w:tcPr>
+            <w:tcW w:type="dxa" w:w="2160"/>
+          </w:tcPr>
+          <w:p>
+            <w:r>
+              <w:rPr>
+                <w:b w:val="0"/>
+                <w:sz w:val="19"/>
+              </w:rPr>
+              <w:t>ketoan@demo.scn</w:t>
             </w:r>
           </w:p>
         </w:tc>
@@ -2399,26 +2306,26 @@
       <w:tr>
         <w:tc>
           <w:tcPr>
-            <w:tcW w:type="dxa" w:w="2835"/>
+            <w:tcW w:type="dxa" w:w="2160"/>
           </w:tcPr>
           <w:p>
-            <w:r/>
             <w:r>
               <w:rPr>
+                <w:b w:val="0"/>
                 <w:sz w:val="19"/>
               </w:rPr>
-              <w:t>Giáo viên chủ nhiệm</w:t>
+              <w:t>GV chủ nhiệm</w:t>
             </w:r>
           </w:p>
         </w:tc>
         <w:tc>
           <w:tcPr>
-            <w:tcW w:type="dxa" w:w="3402"/>
+            <w:tcW w:type="dxa" w:w="2160"/>
           </w:tcPr>
           <w:p>
-            <w:r/>
             <w:r>
               <w:rPr>
+                <w:b w:val="0"/>
                 <w:sz w:val="19"/>
               </w:rPr>
               <w:t>gvcn@demo.scn</w:t>
@@ -2427,15 +2334,29 @@
         </w:tc>
         <w:tc>
           <w:tcPr>
-            <w:tcW w:type="dxa" w:w="2268"/>
+            <w:tcW w:type="dxa" w:w="2160"/>
           </w:tcPr>
           <w:p>
-            <w:r/>
             <w:r>
               <w:rPr>
+                <w:b w:val="0"/>
                 <w:sz w:val="19"/>
               </w:rPr>
-              <w:t>demo1234</w:t>
+              <w:t>Học sinh</w:t>
+            </w:r>
+          </w:p>
+        </w:tc>
+        <w:tc>
+          <w:tcPr>
+            <w:tcW w:type="dxa" w:w="2160"/>
+          </w:tcPr>
+          <w:p>
+            <w:r>
+              <w:rPr>
+                <w:b w:val="0"/>
+                <w:sz w:val="19"/>
+              </w:rPr>
+              <w:t>hocsinh@demo.scn</w:t>
             </w:r>
           </w:p>
         </w:tc>
@@ -2443,28 +2364,26 @@
       <w:tr>
         <w:tc>
           <w:tcPr>
-            <w:tcW w:type="dxa" w:w="2835"/>
-            <w:shd w:val="clear" w:fill="F4F6FA"/>
+            <w:tcW w:type="dxa" w:w="2160"/>
           </w:tcPr>
           <w:p>
-            <w:r/>
             <w:r>
               <w:rPr>
+                <w:b w:val="0"/>
                 <w:sz w:val="19"/>
               </w:rPr>
-              <w:t>Giáo viên bộ môn</w:t>
+              <w:t>GV bộ môn</w:t>
             </w:r>
           </w:p>
         </w:tc>
         <w:tc>
           <w:tcPr>
-            <w:tcW w:type="dxa" w:w="3402"/>
-            <w:shd w:val="clear" w:fill="F4F6FA"/>
+            <w:tcW w:type="dxa" w:w="2160"/>
           </w:tcPr>
           <w:p>
-            <w:r/>
             <w:r>
               <w:rPr>
+                <w:b w:val="0"/>
                 <w:sz w:val="19"/>
               </w:rPr>
               <w:t>gvbm@demo.scn</w:t>
@@ -2473,165 +2392,12 @@
         </w:tc>
         <w:tc>
           <w:tcPr>
-            <w:tcW w:type="dxa" w:w="2268"/>
-            <w:shd w:val="clear" w:fill="F4F6FA"/>
+            <w:tcW w:type="dxa" w:w="2160"/>
           </w:tcPr>
           <w:p>
-            <w:r/>
             <w:r>
               <w:rPr>
-                <w:sz w:val="19"/>
-              </w:rPr>
-              <w:t>demo1234</w:t>
-            </w:r>
-          </w:p>
-        </w:tc>
-      </w:tr>
-      <w:tr>
-        <w:tc>
-          <w:tcPr>
-            <w:tcW w:type="dxa" w:w="2835"/>
-          </w:tcPr>
-          <w:p>
-            <w:r/>
-            <w:r>
-              <w:rPr>
-                <w:sz w:val="19"/>
-              </w:rPr>
-              <w:t>Tổ trưởng chuyên môn</w:t>
-            </w:r>
-          </w:p>
-        </w:tc>
-        <w:tc>
-          <w:tcPr>
-            <w:tcW w:type="dxa" w:w="3402"/>
-          </w:tcPr>
-          <w:p>
-            <w:r/>
-            <w:r>
-              <w:rPr>
-                <w:sz w:val="19"/>
-              </w:rPr>
-              <w:t>totruong@demo.scn</w:t>
-            </w:r>
-          </w:p>
-        </w:tc>
-        <w:tc>
-          <w:tcPr>
-            <w:tcW w:type="dxa" w:w="2268"/>
-          </w:tcPr>
-          <w:p>
-            <w:r/>
-            <w:r>
-              <w:rPr>
-                <w:sz w:val="19"/>
-              </w:rPr>
-              <w:t>demo1234</w:t>
-            </w:r>
-          </w:p>
-        </w:tc>
-      </w:tr>
-      <w:tr>
-        <w:tc>
-          <w:tcPr>
-            <w:tcW w:type="dxa" w:w="2835"/>
-            <w:shd w:val="clear" w:fill="F4F6FA"/>
-          </w:tcPr>
-          <w:p>
-            <w:r/>
-            <w:r>
-              <w:rPr>
-                <w:sz w:val="19"/>
-              </w:rPr>
-              <w:t>Kế toán</w:t>
-            </w:r>
-          </w:p>
-        </w:tc>
-        <w:tc>
-          <w:tcPr>
-            <w:tcW w:type="dxa" w:w="3402"/>
-            <w:shd w:val="clear" w:fill="F4F6FA"/>
-          </w:tcPr>
-          <w:p>
-            <w:r/>
-            <w:r>
-              <w:rPr>
-                <w:sz w:val="19"/>
-              </w:rPr>
-              <w:t>ketoan@demo.scn</w:t>
-            </w:r>
-          </w:p>
-        </w:tc>
-        <w:tc>
-          <w:tcPr>
-            <w:tcW w:type="dxa" w:w="2268"/>
-            <w:shd w:val="clear" w:fill="F4F6FA"/>
-          </w:tcPr>
-          <w:p>
-            <w:r/>
-            <w:r>
-              <w:rPr>
-                <w:sz w:val="19"/>
-              </w:rPr>
-              <w:t>demo1234</w:t>
-            </w:r>
-          </w:p>
-        </w:tc>
-      </w:tr>
-      <w:tr>
-        <w:tc>
-          <w:tcPr>
-            <w:tcW w:type="dxa" w:w="2835"/>
-          </w:tcPr>
-          <w:p>
-            <w:r/>
-            <w:r>
-              <w:rPr>
-                <w:sz w:val="19"/>
-              </w:rPr>
-              <w:t>Học sinh</w:t>
-            </w:r>
-          </w:p>
-        </w:tc>
-        <w:tc>
-          <w:tcPr>
-            <w:tcW w:type="dxa" w:w="3402"/>
-          </w:tcPr>
-          <w:p>
-            <w:r/>
-            <w:r>
-              <w:rPr>
-                <w:sz w:val="19"/>
-              </w:rPr>
-              <w:t>hocsinh@demo.scn</w:t>
-            </w:r>
-          </w:p>
-        </w:tc>
-        <w:tc>
-          <w:tcPr>
-            <w:tcW w:type="dxa" w:w="2268"/>
-          </w:tcPr>
-          <w:p>
-            <w:r/>
-            <w:r>
-              <w:rPr>
-                <w:sz w:val="19"/>
-              </w:rPr>
-              <w:t>demo1234</w:t>
-            </w:r>
-          </w:p>
-        </w:tc>
-      </w:tr>
-      <w:tr>
-        <w:tc>
-          <w:tcPr>
-            <w:tcW w:type="dxa" w:w="2835"/>
-            <w:shd w:val="clear" w:fill="F4F6FA"/>
-          </w:tcPr>
-          <w:p>
-            <w:r/>
-            <w:r>
-              <w:rPr>
+                <w:b w:val="0"/>
                 <w:sz w:val="19"/>
               </w:rPr>
               <w:t>Phụ huynh</w:t>
@@ -2640,31 +2406,15 @@
         </w:tc>
         <w:tc>
           <w:tcPr>
-            <w:tcW w:type="dxa" w:w="3402"/>
-            <w:shd w:val="clear" w:fill="F4F6FA"/>
+            <w:tcW w:type="dxa" w:w="2160"/>
           </w:tcPr>
           <w:p>
-            <w:r/>
             <w:r>
               <w:rPr>
+                <w:b w:val="0"/>
                 <w:sz w:val="19"/>
               </w:rPr>
               <w:t>phuhuynh@demo.scn</w:t>
-            </w:r>
-          </w:p>
-        </w:tc>
-        <w:tc>
-          <w:tcPr>
-            <w:tcW w:type="dxa" w:w="2268"/>
-            <w:shd w:val="clear" w:fill="F4F6FA"/>
-          </w:tcPr>
-          <w:p>
-            <w:r/>
-            <w:r>
-              <w:rPr>
-                <w:sz w:val="19"/>
-              </w:rPr>
-              <w:t>demo1234</w:t>
             </w:r>
           </w:p>
         </w:tc>
@@ -2672,93 +2422,86 @@
       <w:tr>
         <w:tc>
           <w:tcPr>
-            <w:tcW w:type="dxa" w:w="2835"/>
+            <w:tcW w:type="dxa" w:w="2160"/>
           </w:tcPr>
           <w:p>
-            <w:r/>
             <w:r>
               <w:rPr>
+                <w:b w:val="0"/>
                 <w:sz w:val="19"/>
               </w:rPr>
-              <w:t>Sở GD&amp;ĐT / UBND</w:t>
+              <w:t>Sở GD&amp;ĐT</w:t>
             </w:r>
           </w:p>
         </w:tc>
         <w:tc>
           <w:tcPr>
-            <w:tcW w:type="dxa" w:w="3402"/>
+            <w:tcW w:type="dxa" w:w="2160"/>
           </w:tcPr>
           <w:p>
-            <w:r/>
             <w:r>
               <w:rPr>
+                <w:b w:val="0"/>
                 <w:sz w:val="19"/>
               </w:rPr>
-              <w:t>sogd@demo.scn / ubnd@demo.scn</w:t>
+              <w:t>sogd@demo.scn</w:t>
             </w:r>
           </w:p>
         </w:tc>
         <w:tc>
           <w:tcPr>
-            <w:tcW w:type="dxa" w:w="2268"/>
+            <w:tcW w:type="dxa" w:w="2160"/>
           </w:tcPr>
           <w:p>
-            <w:r/>
             <w:r>
               <w:rPr>
+                <w:b w:val="0"/>
                 <w:sz w:val="19"/>
               </w:rPr>
-              <w:t>demo1234</w:t>
+              <w:t>UBND</w:t>
+            </w:r>
+          </w:p>
+        </w:tc>
+        <w:tc>
+          <w:tcPr>
+            <w:tcW w:type="dxa" w:w="2160"/>
+          </w:tcPr>
+          <w:p>
+            <w:r>
+              <w:rPr>
+                <w:b w:val="0"/>
+                <w:sz w:val="19"/>
+              </w:rPr>
+              <w:t>ubnd@demo.scn</w:t>
             </w:r>
           </w:p>
         </w:tc>
       </w:tr>
     </w:tbl>
     <w:p>
-      <w:pPr>
-        <w:spacing w:after="40"/>
-      </w:pPr>
-    </w:p>
-    <w:p>
-      <w:pPr>
-        <w:spacing w:after="120"/>
-      </w:pPr>
       <w:r>
         <w:rPr>
-          <w:b w:val="0"/>
-          <w:i/>
-          <w:sz w:val="21"/>
+          <w:sz w:val="20"/>
         </w:rPr>
-        <w:t>Kịch bản trải nghiệm gợi ý trong 10 phút: mở vieschool.com → vào English Arena chơi thử 1 vòng → đăng nhập demo_hs xem đủ 4 vòng → sang congcuso soạn một đề thi → sang sochunhiem điểm danh thử với gvcn@demo.scn rồi xem dashboard bằng bgh@demo.scn.</w:t>
+        <w:t>Kịch bản trải nghiệm gợi ý trong 10 phút: mở vieschool.com → vào English Arena chơi thử 1 vòng → đăng nhập TVC360 → đăng nhập Sổ CN theo vai trò.</w:t>
       </w:r>
     </w:p>
     <w:p>
       <w:r>
-        <w:br w:type="page"/>
+        <w:rPr>
+          <w:b/>
+          <w:color w:val="0B1B3A"/>
+          <w:sz w:val="36"/>
+        </w:rPr>
+        <w:t>4. Giá niêm yết</w:t>
       </w:r>
     </w:p>
     <w:p>
-      <w:pPr>
-        <w:spacing w:before="280" w:after="120"/>
-      </w:pPr>
       <w:r>
         <w:rPr>
           <w:b/>
           <w:color w:val="0B1B3A"/>
           <w:sz w:val="28"/>
-        </w:rPr>
-        <w:t>4. Giá niêm yết</w:t>
-      </w:r>
-    </w:p>
-    <w:p>
-      <w:pPr>
-        <w:spacing w:before="280" w:after="120"/>
-      </w:pPr>
-      <w:r>
-        <w:rPr>
-          <w:b/>
-          <w:color w:val="0B1B3A"/>
-          <w:sz w:val="24"/>
         </w:rPr>
         <w:t>4.1 English Arena</w:t>
       </w:r>
@@ -2767,26 +2510,23 @@
       <w:tblPr>
         <w:tblStyle w:val="TableGrid"/>
         <w:tblW w:type="auto" w:w="0"/>
-        <w:jc w:val="center"/>
         <w:tblLook w:firstColumn="1" w:firstRow="1" w:lastColumn="0" w:lastRow="0" w:noHBand="0" w:noVBand="1" w:val="04A0"/>
       </w:tblPr>
       <w:tblGrid>
-        <w:gridCol w:w="3249"/>
-        <w:gridCol w:w="3249"/>
-        <w:gridCol w:w="3249"/>
+        <w:gridCol w:w="2880"/>
+        <w:gridCol w:w="2880"/>
+        <w:gridCol w:w="2880"/>
       </w:tblGrid>
       <w:tr>
         <w:tc>
           <w:tcPr>
-            <w:tcW w:type="dxa" w:w="2268"/>
-            <w:shd w:val="clear" w:fill="0B1B3A"/>
+            <w:tcW w:type="dxa" w:w="2880"/>
           </w:tcPr>
           <w:p>
-            <w:r/>
             <w:r>
               <w:rPr>
                 <w:b/>
-                <w:color w:val="FFFFFF"/>
+                <w:color w:val="0B1B3A"/>
                 <w:sz w:val="19"/>
               </w:rPr>
               <w:t>Gói</w:t>
@@ -2795,15 +2535,13 @@
         </w:tc>
         <w:tc>
           <w:tcPr>
-            <w:tcW w:type="dxa" w:w="2835"/>
-            <w:shd w:val="clear" w:fill="0B1B3A"/>
+            <w:tcW w:type="dxa" w:w="2880"/>
           </w:tcPr>
           <w:p>
-            <w:r/>
             <w:r>
               <w:rPr>
                 <w:b/>
-                <w:color w:val="FFFFFF"/>
+                <w:color w:val="0B1B3A"/>
                 <w:sz w:val="19"/>
               </w:rPr>
               <w:t>Giá</w:t>
@@ -2812,15 +2550,13 @@
         </w:tc>
         <w:tc>
           <w:tcPr>
-            <w:tcW w:type="dxa" w:w="4535"/>
-            <w:shd w:val="clear" w:fill="0B1B3A"/>
+            <w:tcW w:type="dxa" w:w="2880"/>
           </w:tcPr>
           <w:p>
-            <w:r/>
             <w:r>
               <w:rPr>
                 <w:b/>
-                <w:color w:val="FFFFFF"/>
+                <w:color w:val="0B1B3A"/>
                 <w:sz w:val="19"/>
               </w:rPr>
               <w:t>Quyền lợi</w:t>
@@ -2831,12 +2567,12 @@
       <w:tr>
         <w:tc>
           <w:tcPr>
-            <w:tcW w:type="dxa" w:w="2268"/>
+            <w:tcW w:type="dxa" w:w="2880"/>
           </w:tcPr>
           <w:p>
-            <w:r/>
             <w:r>
               <w:rPr>
+                <w:b w:val="0"/>
                 <w:sz w:val="19"/>
               </w:rPr>
               <w:t>Khách (Guest)</w:t>
@@ -2845,12 +2581,12 @@
         </w:tc>
         <w:tc>
           <w:tcPr>
-            <w:tcW w:type="dxa" w:w="2835"/>
+            <w:tcW w:type="dxa" w:w="2880"/>
           </w:tcPr>
           <w:p>
-            <w:r/>
             <w:r>
               <w:rPr>
+                <w:b w:val="0"/>
                 <w:sz w:val="19"/>
               </w:rPr>
               <w:t>Miễn phí</w:t>
@@ -2859,12 +2595,12 @@
         </w:tc>
         <w:tc>
           <w:tcPr>
-            <w:tcW w:type="dxa" w:w="4535"/>
+            <w:tcW w:type="dxa" w:w="2880"/>
           </w:tcPr>
           <w:p>
-            <w:r/>
             <w:r>
               <w:rPr>
+                <w:b w:val="0"/>
                 <w:sz w:val="19"/>
               </w:rPr>
               <w:t>Chơi thử 1 vòng mỗi lớp, không cần tài khoản</w:t>
@@ -2875,13 +2611,12 @@
       <w:tr>
         <w:tc>
           <w:tcPr>
-            <w:tcW w:type="dxa" w:w="2268"/>
-            <w:shd w:val="clear" w:fill="F4F6FA"/>
+            <w:tcW w:type="dxa" w:w="2880"/>
           </w:tcPr>
           <w:p>
-            <w:r/>
             <w:r>
               <w:rPr>
+                <w:b w:val="0"/>
                 <w:sz w:val="19"/>
               </w:rPr>
               <w:t>Gia đình</w:t>
@@ -2890,31 +2625,29 @@
         </w:tc>
         <w:tc>
           <w:tcPr>
-            <w:tcW w:type="dxa" w:w="2835"/>
-            <w:shd w:val="clear" w:fill="F4F6FA"/>
+            <w:tcW w:type="dxa" w:w="2880"/>
           </w:tcPr>
           <w:p>
-            <w:r/>
             <w:r>
               <w:rPr>
+                <w:b w:val="0"/>
                 <w:sz w:val="19"/>
               </w:rPr>
-              <w:t>249.000đ/học sinh/năm</w:t>
+              <w:t>249.000đ / 6 tháng hoặc 399.000đ / năm</w:t>
             </w:r>
           </w:p>
         </w:tc>
         <w:tc>
           <w:tcPr>
-            <w:tcW w:type="dxa" w:w="4535"/>
-            <w:shd w:val="clear" w:fill="F4F6FA"/>
+            <w:tcW w:type="dxa" w:w="2880"/>
           </w:tcPr>
           <w:p>
-            <w:r/>
             <w:r>
               <w:rPr>
+                <w:b w:val="0"/>
                 <w:sz w:val="19"/>
               </w:rPr>
-              <w:t>Đủ 5 khối, đủ 4 vòng, lưu tiến độ và thành tích</w:t>
+              <w:t>Đủ 5 khối, đủ 3 môn, lưu tiến độ và thành tích</w:t>
             </w:r>
           </w:p>
         </w:tc>
@@ -2922,12 +2655,56 @@
       <w:tr>
         <w:tc>
           <w:tcPr>
-            <w:tcW w:type="dxa" w:w="2268"/>
+            <w:tcW w:type="dxa" w:w="2880"/>
           </w:tcPr>
           <w:p>
-            <w:r/>
             <w:r>
               <w:rPr>
+                <w:b w:val="0"/>
+                <w:sz w:val="19"/>
+              </w:rPr>
+              <w:t>Nhóm lớp (phụ huynh mua)</w:t>
+            </w:r>
+          </w:p>
+        </w:tc>
+        <w:tc>
+          <w:tcPr>
+            <w:tcW w:type="dxa" w:w="2880"/>
+          </w:tcPr>
+          <w:p>
+            <w:r>
+              <w:rPr>
+                <w:b w:val="0"/>
+                <w:sz w:val="19"/>
+              </w:rPr>
+              <w:t>199.000đ / học sinh / năm</w:t>
+            </w:r>
+          </w:p>
+        </w:tc>
+        <w:tc>
+          <w:tcPr>
+            <w:tcW w:type="dxa" w:w="2880"/>
+          </w:tcPr>
+          <w:p>
+            <w:r>
+              <w:rPr>
+                <w:b w:val="0"/>
+                <w:sz w:val="19"/>
+              </w:rPr>
+              <w:t>Tối thiểu 15 học sinh; vào lớp tự phục vụ bằng mã lớp</w:t>
+            </w:r>
+          </w:p>
+        </w:tc>
+      </w:tr>
+      <w:tr>
+        <w:tc>
+          <w:tcPr>
+            <w:tcW w:type="dxa" w:w="2880"/>
+          </w:tcPr>
+          <w:p>
+            <w:r>
+              <w:rPr>
+                <w:b w:val="0"/>
                 <w:sz w:val="19"/>
               </w:rPr>
               <w:t>Nhà trường</w:t>
@@ -2936,48 +2713,40 @@
         </w:tc>
         <w:tc>
           <w:tcPr>
-            <w:tcW w:type="dxa" w:w="2835"/>
+            <w:tcW w:type="dxa" w:w="2880"/>
           </w:tcPr>
           <w:p>
-            <w:r/>
             <w:r>
               <w:rPr>
+                <w:b w:val="0"/>
                 <w:sz w:val="19"/>
               </w:rPr>
-              <w:t>30.000 - 50.000đ/học sinh/năm</w:t>
+              <w:t>99.000đ / học sinh / năm (79.000đ từ 300 HS)</w:t>
             </w:r>
           </w:p>
         </w:tc>
         <w:tc>
           <w:tcPr>
-            <w:tcW w:type="dxa" w:w="4535"/>
+            <w:tcW w:type="dxa" w:w="2880"/>
           </w:tcPr>
           <w:p>
-            <w:r/>
             <w:r>
               <w:rPr>
+                <w:b w:val="0"/>
                 <w:sz w:val="19"/>
               </w:rPr>
-              <w:t>Theo quy mô; kèm console quản lý lớp và báo cáo cho giáo viên</w:t>
+              <w:t>Console quản lý lớp, báo cáo; 800+ HS báo giá riêng</w:t>
             </w:r>
           </w:p>
         </w:tc>
       </w:tr>
     </w:tbl>
     <w:p>
-      <w:pPr>
-        <w:spacing w:after="40"/>
-      </w:pPr>
-    </w:p>
-    <w:p>
-      <w:pPr>
-        <w:spacing w:before="280" w:after="120"/>
-      </w:pPr>
       <w:r>
         <w:rPr>
           <w:b/>
           <w:color w:val="0B1B3A"/>
-          <w:sz w:val="24"/>
+          <w:sz w:val="28"/>
         </w:rPr>
         <w:t>4.2 Công cụ số Giáo viên</w:t>
       </w:r>
@@ -2986,26 +2755,23 @@
       <w:tblPr>
         <w:tblStyle w:val="TableGrid"/>
         <w:tblW w:type="auto" w:w="0"/>
-        <w:jc w:val="center"/>
         <w:tblLook w:firstColumn="1" w:firstRow="1" w:lastColumn="0" w:lastRow="0" w:noHBand="0" w:noVBand="1" w:val="04A0"/>
       </w:tblPr>
       <w:tblGrid>
-        <w:gridCol w:w="3249"/>
-        <w:gridCol w:w="3249"/>
-        <w:gridCol w:w="3249"/>
+        <w:gridCol w:w="2880"/>
+        <w:gridCol w:w="2880"/>
+        <w:gridCol w:w="2880"/>
       </w:tblGrid>
       <w:tr>
         <w:tc>
           <w:tcPr>
-            <w:tcW w:type="dxa" w:w="2268"/>
-            <w:shd w:val="clear" w:fill="0B1B3A"/>
+            <w:tcW w:type="dxa" w:w="2880"/>
           </w:tcPr>
           <w:p>
-            <w:r/>
             <w:r>
               <w:rPr>
                 <w:b/>
-                <w:color w:val="FFFFFF"/>
+                <w:color w:val="0B1B3A"/>
                 <w:sz w:val="19"/>
               </w:rPr>
               <w:t>Gói</w:t>
@@ -3014,15 +2780,13 @@
         </w:tc>
         <w:tc>
           <w:tcPr>
-            <w:tcW w:type="dxa" w:w="2835"/>
-            <w:shd w:val="clear" w:fill="0B1B3A"/>
+            <w:tcW w:type="dxa" w:w="2880"/>
           </w:tcPr>
           <w:p>
-            <w:r/>
             <w:r>
               <w:rPr>
                 <w:b/>
-                <w:color w:val="FFFFFF"/>
+                <w:color w:val="0B1B3A"/>
                 <w:sz w:val="19"/>
               </w:rPr>
               <w:t>Giá</w:t>
@@ -3031,15 +2795,13 @@
         </w:tc>
         <w:tc>
           <w:tcPr>
-            <w:tcW w:type="dxa" w:w="4535"/>
-            <w:shd w:val="clear" w:fill="0B1B3A"/>
+            <w:tcW w:type="dxa" w:w="2880"/>
           </w:tcPr>
           <w:p>
-            <w:r/>
             <w:r>
               <w:rPr>
                 <w:b/>
-                <w:color w:val="FFFFFF"/>
+                <w:color w:val="0B1B3A"/>
                 <w:sz w:val="19"/>
               </w:rPr>
               <w:t>Quyền lợi</w:t>
@@ -3050,12 +2812,12 @@
       <w:tr>
         <w:tc>
           <w:tcPr>
-            <w:tcW w:type="dxa" w:w="2268"/>
+            <w:tcW w:type="dxa" w:w="2880"/>
           </w:tcPr>
           <w:p>
-            <w:r/>
             <w:r>
               <w:rPr>
+                <w:b w:val="0"/>
                 <w:sz w:val="19"/>
               </w:rPr>
               <w:t>Giáo viên lẻ</w:t>
@@ -3064,26 +2826,26 @@
         </w:tc>
         <w:tc>
           <w:tcPr>
-            <w:tcW w:type="dxa" w:w="2835"/>
+            <w:tcW w:type="dxa" w:w="2880"/>
           </w:tcPr>
           <w:p>
-            <w:r/>
             <w:r>
               <w:rPr>
+                <w:b w:val="0"/>
                 <w:sz w:val="19"/>
               </w:rPr>
-              <w:t>299.000đ/giáo viên/năm</w:t>
+              <w:t>299.000đ / giáo viên / năm</w:t>
             </w:r>
           </w:p>
         </w:tc>
         <w:tc>
           <w:tcPr>
-            <w:tcW w:type="dxa" w:w="4535"/>
+            <w:tcW w:type="dxa" w:w="2880"/>
           </w:tcPr>
           <w:p>
-            <w:r/>
             <w:r>
               <w:rPr>
+                <w:b w:val="0"/>
                 <w:sz w:val="19"/>
               </w:rPr>
               <w:t>Đủ 12 công cụ, xuất DOCX/PDF không giới hạn</w:t>
@@ -3094,13 +2856,12 @@
       <w:tr>
         <w:tc>
           <w:tcPr>
-            <w:tcW w:type="dxa" w:w="2268"/>
-            <w:shd w:val="clear" w:fill="F4F6FA"/>
+            <w:tcW w:type="dxa" w:w="2880"/>
           </w:tcPr>
           <w:p>
-            <w:r/>
             <w:r>
               <w:rPr>
+                <w:b w:val="0"/>
                 <w:sz w:val="19"/>
               </w:rPr>
               <w:t>Nhà trường</w:t>
@@ -3109,50 +2870,40 @@
         </w:tc>
         <w:tc>
           <w:tcPr>
-            <w:tcW w:type="dxa" w:w="2835"/>
-            <w:shd w:val="clear" w:fill="F4F6FA"/>
+            <w:tcW w:type="dxa" w:w="2880"/>
           </w:tcPr>
           <w:p>
-            <w:r/>
             <w:r>
               <w:rPr>
+                <w:b w:val="0"/>
                 <w:sz w:val="19"/>
               </w:rPr>
-              <w:t>199.000đ/giáo viên/năm</w:t>
+              <w:t>199.000đ / giáo viên / năm</w:t>
             </w:r>
           </w:p>
         </w:tc>
         <w:tc>
           <w:tcPr>
-            <w:tcW w:type="dxa" w:w="4535"/>
-            <w:shd w:val="clear" w:fill="F4F6FA"/>
+            <w:tcW w:type="dxa" w:w="2880"/>
           </w:tcPr>
           <w:p>
-            <w:r/>
             <w:r>
               <w:rPr>
+                <w:b w:val="0"/>
                 <w:sz w:val="19"/>
               </w:rPr>
-              <w:t>Cho từ 10 giáo viên; kèm luồng kiểm định và thư viện chung của trường</w:t>
+              <w:t>Từ 10 giáo viên; kèm luồng kiểm định nội bộ</w:t>
             </w:r>
           </w:p>
         </w:tc>
       </w:tr>
     </w:tbl>
     <w:p>
-      <w:pPr>
-        <w:spacing w:after="40"/>
-      </w:pPr>
-    </w:p>
-    <w:p>
-      <w:pPr>
-        <w:spacing w:before="280" w:after="120"/>
-      </w:pPr>
       <w:r>
         <w:rPr>
           <w:b/>
           <w:color w:val="0B1B3A"/>
-          <w:sz w:val="24"/>
+          <w:sz w:val="28"/>
         </w:rPr>
         <w:t>4.3 Sổ Chủ Nhiệm Số</w:t>
       </w:r>
@@ -3161,26 +2912,23 @@
       <w:tblPr>
         <w:tblStyle w:val="TableGrid"/>
         <w:tblW w:type="auto" w:w="0"/>
-        <w:jc w:val="center"/>
         <w:tblLook w:firstColumn="1" w:firstRow="1" w:lastColumn="0" w:lastRow="0" w:noHBand="0" w:noVBand="1" w:val="04A0"/>
       </w:tblPr>
       <w:tblGrid>
-        <w:gridCol w:w="3249"/>
-        <w:gridCol w:w="3249"/>
-        <w:gridCol w:w="3249"/>
+        <w:gridCol w:w="2880"/>
+        <w:gridCol w:w="2880"/>
+        <w:gridCol w:w="2880"/>
       </w:tblGrid>
       <w:tr>
         <w:tc>
           <w:tcPr>
-            <w:tcW w:type="dxa" w:w="2268"/>
-            <w:shd w:val="clear" w:fill="0B1B3A"/>
+            <w:tcW w:type="dxa" w:w="2880"/>
           </w:tcPr>
           <w:p>
-            <w:r/>
             <w:r>
               <w:rPr>
                 <w:b/>
-                <w:color w:val="FFFFFF"/>
+                <w:color w:val="0B1B3A"/>
                 <w:sz w:val="19"/>
               </w:rPr>
               <w:t>Gói</w:t>
@@ -3189,15 +2937,13 @@
         </w:tc>
         <w:tc>
           <w:tcPr>
-            <w:tcW w:type="dxa" w:w="2835"/>
-            <w:shd w:val="clear" w:fill="0B1B3A"/>
+            <w:tcW w:type="dxa" w:w="2880"/>
           </w:tcPr>
           <w:p>
-            <w:r/>
             <w:r>
               <w:rPr>
                 <w:b/>
-                <w:color w:val="FFFFFF"/>
+                <w:color w:val="0B1B3A"/>
                 <w:sz w:val="19"/>
               </w:rPr>
               <w:t>Giá</w:t>
@@ -3206,15 +2952,13 @@
         </w:tc>
         <w:tc>
           <w:tcPr>
-            <w:tcW w:type="dxa" w:w="4535"/>
-            <w:shd w:val="clear" w:fill="0B1B3A"/>
+            <w:tcW w:type="dxa" w:w="2880"/>
           </w:tcPr>
           <w:p>
-            <w:r/>
             <w:r>
               <w:rPr>
                 <w:b/>
-                <w:color w:val="FFFFFF"/>
+                <w:color w:val="0B1B3A"/>
                 <w:sz w:val="19"/>
               </w:rPr>
               <w:t>Quyền lợi</w:t>
@@ -3225,12 +2969,12 @@
       <w:tr>
         <w:tc>
           <w:tcPr>
-            <w:tcW w:type="dxa" w:w="2268"/>
+            <w:tcW w:type="dxa" w:w="2880"/>
           </w:tcPr>
           <w:p>
-            <w:r/>
             <w:r>
               <w:rPr>
+                <w:b w:val="0"/>
                 <w:sz w:val="19"/>
               </w:rPr>
               <w:t>Theo học sinh</w:t>
@@ -3239,88 +2983,66 @@
         </w:tc>
         <w:tc>
           <w:tcPr>
-            <w:tcW w:type="dxa" w:w="2835"/>
+            <w:tcW w:type="dxa" w:w="2880"/>
           </w:tcPr>
           <w:p>
-            <w:r/>
             <w:r>
               <w:rPr>
+                <w:b w:val="0"/>
                 <w:sz w:val="19"/>
               </w:rPr>
-              <w:t>15.000 - 25.000đ/học sinh/năm</w:t>
+              <w:t>15.000 - 25.000đ / học sinh / năm</w:t>
             </w:r>
           </w:p>
         </w:tc>
         <w:tc>
           <w:tcPr>
-            <w:tcW w:type="dxa" w:w="4535"/>
+            <w:tcW w:type="dxa" w:w="2880"/>
           </w:tcPr>
           <w:p>
-            <w:r/>
             <w:r>
               <w:rPr>
+                <w:b w:val="0"/>
                 <w:sz w:val="19"/>
               </w:rPr>
-              <w:t>Theo quy mô trường; đủ module chủ nhiệm, điểm danh, báo cáo BGH, cổng phụ huynh</w:t>
+              <w:t>Theo quy mô trường; đủ module chủ nhiệm, điểm, hạnh kiểm</w:t>
             </w:r>
           </w:p>
         </w:tc>
       </w:tr>
     </w:tbl>
     <w:p>
-      <w:pPr>
-        <w:spacing w:after="40"/>
-      </w:pPr>
-    </w:p>
-    <w:p>
-      <w:pPr>
-        <w:spacing w:before="280" w:after="120"/>
-      </w:pPr>
       <w:r>
         <w:rPr>
           <w:b/>
           <w:color w:val="0B1B3A"/>
-          <w:sz w:val="24"/>
+          <w:sz w:val="28"/>
         </w:rPr>
         <w:t>4.4 Gói trọn bộ cho nhà trường</w:t>
       </w:r>
     </w:p>
     <w:p>
-      <w:pPr>
-        <w:spacing w:after="120"/>
-      </w:pPr>
       <w:r>
         <w:rPr>
-          <w:b w:val="0"/>
-          <w:i w:val="0"/>
-          <w:sz w:val="21"/>
+          <w:sz w:val="22"/>
         </w:rPr>
-        <w:t>Trường dùng đồng thời cả 3 sản phẩm được giá bundle ưu đãi - báo giá cụ thể theo số lượng học sinh và giáo viên. Liên hệ để nhận báo giá trong ngày.</w:t>
+        <w:t>Trường dùng đồng thời cả 3 sản phẩm được giá bundle ưu đãi - báo giá cụ thể theo số lượng học sinh và giáo viên.</w:t>
       </w:r>
     </w:p>
     <w:p>
-      <w:pPr>
-        <w:spacing w:after="120"/>
-      </w:pPr>
       <w:r>
         <w:rPr>
-          <w:b w:val="0"/>
-          <w:i/>
-          <w:color w:val="556070"/>
-          <w:sz w:val="21"/>
+          <w:sz w:val="20"/>
         </w:rPr>
-        <w:t>Tất cả gói đều gồm: hỗ trợ triển khai ban đầu, hướng dẫn sử dụng, bảo hành tính năng trong suốt thời gian thuê.</w:t>
+        <w:t>Tất cả gói đều gồm: hỗ trợ triển khai ban đầu, hướng dẫn sử dụng, bảo hành tính năng trong suốt thời gian thuê bao.</w:t>
       </w:r>
     </w:p>
     <w:p>
-      <w:pPr>
-        <w:spacing w:before="280" w:after="120"/>
-      </w:pPr>
       <w:r>
         <w:rPr>
           <w:b/>
           <w:color w:val="0B1B3A"/>
-          <w:sz w:val="28"/>
+          <w:sz w:val="36"/>
         </w:rPr>
         <w:t>5. Vì sao chọn VieSchool</w:t>
       </w:r>
@@ -3328,91 +3050,61 @@
     <w:p>
       <w:pPr>
         <w:pStyle w:val="ListBullet"/>
-        <w:spacing w:after="60"/>
       </w:pPr>
       <w:r>
-        <w:rPr>
-          <w:b/>
-        </w:rPr>
-        <w:t xml:space="preserve">Đúng chương trình Việt Nam: </w:t>
-      </w:r>
-      <w:r>
-        <w:t>Nội dung bám SGK Tiếng Anh Global Success theo CTGDPT 2018 - luyện trên app là học đúng điều đang học trên lớp.</w:t>
+        <w:t>Đúng chương trình Việt Nam: nội dung bám SGK Tiếng Anh Global Success theo CTGDPT 2018 - luyện trên app là học đúng điều đang học trên lớp.</w:t>
       </w:r>
     </w:p>
     <w:p>
       <w:pPr>
         <w:pStyle w:val="ListBullet"/>
-        <w:spacing w:after="60"/>
       </w:pPr>
       <w:r>
-        <w:rPr>
-          <w:b/>
-        </w:rPr>
-        <w:t xml:space="preserve">Trọn trong một hệ sinh thái: </w:t>
-      </w:r>
-      <w:r>
-        <w:t>Một nền tảng thay cho ba ứng dụng rời rạc - dữ liệu lớp, tài khoản, phân quyền thống nhất.</w:t>
+        <w:t>Trọn trong một hệ sinh thái: một nền tảng thay cho ba ứng dụng rời rạc - dữ liệu lớp, tài khoản, phân quyền thống nhất.</w:t>
       </w:r>
     </w:p>
     <w:p>
       <w:pPr>
         <w:pStyle w:val="ListBullet"/>
-        <w:spacing w:after="60"/>
       </w:pPr>
       <w:r>
-        <w:rPr>
-          <w:b/>
-        </w:rPr>
-        <w:t xml:space="preserve">Trọng tâm là trẻ em: </w:t>
-      </w:r>
-      <w:r>
-        <w:t>Không quảng cáo, không chat công khai, nút chạm lớn phù hợp trẻ nhỏ, hỗ trợ giảm chuyển động.</w:t>
+        <w:t>Trọng tâm là trẻ em: không quảng cáo, không chat công khai, nút chạm lớn phù hợp trẻ nhỏ, giải thích tiếng Việt khi trả lời sai.</w:t>
       </w:r>
     </w:p>
     <w:p>
       <w:pPr>
         <w:pStyle w:val="ListBullet"/>
-        <w:spacing w:after="60"/>
       </w:pPr>
       <w:r>
-        <w:rPr>
-          <w:b/>
-        </w:rPr>
-        <w:t xml:space="preserve">Theo kịp quy định: </w:t>
-      </w:r>
-      <w:r>
-        <w:t>Sổ chủ nhiệm và công cụ giáo viên cập nhật theo Điều lệ trường mới nhất (TT 15/2026/TT-BGDĐT).</w:t>
+        <w:t>Bản quyền rõ ràng: toàn bộ hình ảnh và font chữ có giấy phép khai báo công khai trong sản phẩm - an tâm triển khai trong trường công lập.</w:t>
       </w:r>
     </w:p>
     <w:p>
       <w:pPr>
-        <w:spacing w:after="120"/>
+        <w:pStyle w:val="ListBullet"/>
       </w:pPr>
       <w:r>
+        <w:t>Theo kịp quy định: sổ chủ nhiệm và công cụ giáo viên cập nhật theo Điều lệ trường mới nhất (TT 15/2026/TT-BGDĐT).</w:t>
+      </w:r>
+    </w:p>
+    <w:p>
+      <w:r>
         <w:rPr>
-          <w:b w:val="0"/>
-          <w:i w:val="0"/>
-          <w:sz w:val="21"/>
+          <w:sz w:val="22"/>
         </w:rPr>
       </w:r>
     </w:p>
     <w:p>
-      <w:pPr>
-        <w:spacing w:after="120"/>
-      </w:pPr>
       <w:r>
         <w:rPr>
-          <w:b/>
-          <w:i w:val="0"/>
-          <w:sz w:val="21"/>
+          <w:sz w:val="22"/>
         </w:rPr>
         <w:t>Liên hệ: vieschool.com - đội ngũ VieSchool hỗ trợ demo trực tiếp tại trường hoặc online.</w:t>
       </w:r>
     </w:p>
     <w:sectPr>
       <w:pgSz w:w="12240" w:h="15840"/>
-      <w:pgMar w:top="1020" w:right="1247" w:bottom="1020" w:left="1247" w:header="720" w:footer="720" w:gutter="0"/>
+      <w:pgMar w:top="1440" w:right="1800" w:bottom="1440" w:left="1800" w:header="720" w:footer="720" w:gutter="0"/>
       <w:cols w:space="720"/>
       <w:docGrid w:linePitch="360"/>
     </w:sectPr>
@@ -3784,8 +3476,8 @@
     <w:qFormat/>
     <w:rsid w:val="00FC693F"/>
     <w:rPr>
-      <w:rFonts w:ascii="Be Vietnam Pro" w:hAnsi="Be Vietnam Pro" w:eastAsia="Be Vietnam Pro"/>
-      <w:sz w:val="21"/>
+      <w:rFonts w:ascii="Be Vietnam Pro" w:hAnsi="Be Vietnam Pro"/>
+      <w:sz w:val="22"/>
     </w:rPr>
   </w:style>
   <w:style w:type="paragraph" w:styleId="Header">

</xml_diff>